<commit_message>
W 10-07-2026 pipeline: beats.json, search, shortlist (Checkpoint 2)
Co-Authored-By: Claude Opus 5.5 <noreply@anthropic.com>
Claude-Session: https://claude.ai/code/session_01F5T5EfKU7bvTfCbU31zr39
</commit_message>
<xml_diff>
--- a/runs/W_10072026/10_07_OUTLINE_WED.docx
+++ b/runs/W_10072026/10_07_OUTLINE_WED.docx
@@ -660,7 +660,7 @@
         <w:spacing w:after="40"/>
       </w:pPr>
       <w:r>
-        <w:t>A's victim is 50: a grandmother, just under the 55+ line. And A's fix is thin (lock photos, keep an alibi trail, demand the face-match report). Enough for an A?</w:t>
+        <w:t>A's victim is 50: a grandmother, just under the 55+ line. A's fix is reworked (9/29): Jeff shows the location history already on his phone, the kind of record that freed her. Keeping location history on is a privacy trade-off; say so on air.</w:t>
       </w:r>
     </w:p>
     <w:p>
@@ -669,7 +669,7 @@
         <w:spacing w:after="40"/>
       </w:pPr>
       <w:r>
-        <w:t>B, per Jeff: lead with the grocery AI cart and Lowe's cameras, not Target. Keep B beat 2 (the viral Target-worker TikTok, B's only person) without naming the brand, or drop it?</w:t>
+        <w:t>B, per Jeff: lead with the grocery AI cart and Lowe's cameras, not Target. B beat 2 stays (producer, 9/29): Target shows have done poorly, but this clip went viral. Don't lean on the brand in copy.</w:t>
       </w:r>
     </w:p>
     <w:p>
@@ -687,7 +687,7 @@
         <w:spacing w:after="40"/>
       </w:pPr>
       <w:r>
-        <w:t>C beat 1 replaces Jeff's drive-thru test (he won't shoot one) with a viral AI drive-thru fail. Frame C as "bringing the humans back," not "ditching the robots": McDonald's is doing both.</w:t>
+        <w:t>C beat 1 replaces Jeff's drive-thru test (he won't shoot one) with a viral AI drive-thru fail. Frame C as "bringing the humans back," not "ditching the robots": McDonald's is doing both. C beats 2 and 3 stay; if no video turns up, a graphic or a cut.</w:t>
       </w:r>
     </w:p>
     <w:p>
@@ -1430,7 +1430,7 @@
               <w:rPr>
                 <w:sz w:val="19"/>
               </w:rPr>
-              <w:t>The fix</w:t>
+              <w:t>Your alibi is in your pocket</w:t>
             </w:r>
           </w:p>
         </w:tc>
@@ -1462,7 +1462,7 @@
               <w:rPr>
                 <w:sz w:val="19"/>
               </w:rPr>
-              <w:t>Jeff locks his public photos down to friends-only on his own phone, live.</w:t>
+              <w:t>Jeff opens the location history already on his phone, the kind of record that freed her.</w:t>
             </w:r>
           </w:p>
         </w:tc>
@@ -1503,13 +1503,19 @@
         <w:spacing w:after="40"/>
       </w:pPr>
       <w:r>
-        <w:t xml:space="preserve">Set Facebook and Instagram profile and tagged photos to friends-only. </w:t>
+        <w:rPr>
+          <w:b/>
+        </w:rPr>
+        <w:t>Your alibi is already on your phone.</w:t>
+      </w:r>
+      <w:r>
+        <w:t xml:space="preserve"> iPhone: Settings → Privacy &amp; Security → Location Services → System Services → Significant Locations &amp; Routes. Android: Google Maps → your profile picture → Your Timeline. Keep it on, or know it's there. </w:t>
       </w:r>
       <w:r>
         <w:rPr>
           <w:i/>
         </w:rPr>
-        <w:t>(verify which systems scrape social media)</w:t>
+        <w:t>(verify on current iOS/Android)</w:t>
       </w:r>
     </w:p>
     <w:p>
@@ -1518,7 +1524,7 @@
         <w:spacing w:after="40"/>
       </w:pPr>
       <w:r>
-        <w:t>Keep an alibi trail: bank and card records and phone location history are what freed her.</w:t>
+        <w:t>Your bank and card statements are the other half of an alibi. Know how to download them fast.</w:t>
       </w:r>
     </w:p>
     <w:p>
@@ -1527,7 +1533,22 @@
         <w:spacing w:after="40"/>
       </w:pPr>
       <w:r>
-        <w:t>If you're ever charged, have your lawyer demand the facial-recognition report and whether a human confirmed it.</w:t>
+        <w:t>If you're ever charged: say nothing without a lawyer, and have the lawyer demand the facial-recognition report and whether a human confirmed the match.</w:t>
+      </w:r>
+    </w:p>
+    <w:p>
+      <w:pPr>
+        <w:pStyle w:val="ListBullet"/>
+        <w:spacing w:after="40"/>
+      </w:pPr>
+      <w:r>
+        <w:t xml:space="preserve">Want your face out of public face-search sites? PimEyes has a free opt-out form (pimeyes.com/en/opt-out). It doesn't touch police databases. </w:t>
+      </w:r>
+      <w:r>
+        <w:rPr>
+          <w:i/>
+        </w:rPr>
+        <w:t>(verify)</w:t>
       </w:r>
     </w:p>
     <w:p>

</xml_diff>

<commit_message>
W 10-07-2026 outline w/ videos (Stage: videos), report, yield log
Co-Authored-By: Claude Opus 5.5 <noreply@anthropic.com>
Claude-Session: https://claude.ai/code/session_01F5T5EfKU7bvTfCbU31zr39
</commit_message>
<xml_diff>
--- a/runs/W_10072026/10_07_OUTLINE_WED.docx
+++ b/runs/W_10072026/10_07_OUTLINE_WED.docx
@@ -57,7 +57,7 @@
         <w:t>Stage:</w:t>
       </w:r>
       <w:r>
-        <w:t xml:space="preserve"> beats</w:t>
+        <w:t xml:space="preserve"> videos</w:t>
       </w:r>
     </w:p>
     <w:p>
@@ -271,7 +271,7 @@
               <w:rPr>
                 <w:sz w:val="19"/>
               </w:rPr>
-              <w:t>5</w:t>
+              <w:t>4/5</w:t>
             </w:r>
           </w:p>
         </w:tc>
@@ -403,7 +403,7 @@
               <w:rPr>
                 <w:sz w:val="19"/>
               </w:rPr>
-              <w:t>3</w:t>
+              <w:t>3/3</w:t>
             </w:r>
           </w:p>
         </w:tc>
@@ -535,7 +535,7 @@
               <w:rPr>
                 <w:sz w:val="19"/>
               </w:rPr>
-              <w:t>3</w:t>
+              <w:t>3/3</w:t>
             </w:r>
           </w:p>
         </w:tc>
@@ -660,7 +660,7 @@
         <w:spacing w:after="40"/>
       </w:pPr>
       <w:r>
-        <w:t>A's victim is 50: a grandmother, just under the 55+ line. A's fix is reworked (9/29): Jeff shows the location history already on his phone, the kind of record that freed her. Keeping location history on is a privacy trade-off; say so on air.</w:t>
+        <w:t>A beat 2 is WEAK (reporter VO; no clip of Lipps speaking) and A beat 5 is THROTTLED (right clip, captions bot-walled). Retry both in a fresh session.</w:t>
       </w:r>
     </w:p>
     <w:p>
@@ -669,7 +669,7 @@
         <w:spacing w:after="40"/>
       </w:pPr>
       <w:r>
-        <w:t>B, per Jeff: lead with the grocery AI cart and Lowe's cameras, not Target. B beat 2 stays (producer, 9/29): Target shows have done poorly, but this clip went viral. Don't lean on the brand in copy.</w:t>
+        <w:t>🚨 CBS misnames her "Lipscomb" on air, twice; A beats 4 and 6 avoid both. Outlets also differ on jail time (6 months vs 2 in North Dakota) and on which image was searched. Settle from the complaint.</w:t>
       </w:r>
     </w:p>
     <w:p>
@@ -678,7 +678,7 @@
         <w:spacing w:after="40"/>
       </w:pPr>
       <w:r>
-        <w:t>B beat 1 wants vertical cart b-roll; a horizontal company video would be a crop. B beat 3 has no person, just Lowe's own privacy statement over plate-camera footage.</w:t>
+        <w:t>A's fix is Jeff showing the location history already on his phone; say on air that keeping it on is a privacy trade-off. Lipps is 50, just under 55+.</w:t>
       </w:r>
     </w:p>
     <w:p>
@@ -687,7 +687,16 @@
         <w:spacing w:after="40"/>
       </w:pPr>
       <w:r>
-        <w:t>C beat 1 replaces Jeff's drive-thru test (he won't shoot one) with a viral AI drive-thru fail. Frame C as "bringing the humans back," not "ditching the robots": McDonald's is doing both. C beats 2 and 3 stay; if no video turns up, a graphic or a cut.</w:t>
+        <w:t>B beat 2 stays (viral, but don't lean on Target). B beat 1 is a CROP (horizontal promo). B beat 3 has no person, just Lowe's own privacy statement.</w:t>
+      </w:r>
+    </w:p>
+    <w:p>
+      <w:pPr>
+        <w:pStyle w:val="ListBullet"/>
+        <w:spacing w:after="40"/>
+      </w:pPr>
+      <w:r>
+        <w:t>C beat 1: two TikToks pulled (McDonald's McNuggets, Taco Bell "one thousand waters"); call later. C beat 2 and C beat 3 are WEAK; graphic fallback per producer. Frame C as "bringing the humans back."</w:t>
       </w:r>
     </w:p>
     <w:p>
@@ -1494,6 +1503,540 @@
           <w:color w:val="333333"/>
           <w:sz w:val="22"/>
         </w:rPr>
+        <w:t>Videos</w:t>
+      </w:r>
+    </w:p>
+    <w:tbl>
+      <w:tblPr>
+        <w:tblStyle w:val="TableGrid"/>
+        <w:tblW w:type="auto" w:w="0"/>
+        <w:jc w:val="center"/>
+        <w:tblLayout w:type="fixed"/>
+        <w:tblLook w:firstColumn="1" w:firstRow="1" w:lastColumn="0" w:lastRow="0" w:noHBand="0" w:noVBand="1" w:val="04A0"/>
+      </w:tblPr>
+      <w:tblGrid>
+        <w:gridCol w:w="432"/>
+        <w:gridCol w:w="2664"/>
+        <w:gridCol w:w="3096"/>
+        <w:gridCol w:w="2376"/>
+        <w:gridCol w:w="1368"/>
+      </w:tblGrid>
+      <w:tr>
+        <w:tc>
+          <w:tcPr>
+            <w:tcW w:type="dxa" w:w="432"/>
+          </w:tcPr>
+          <w:p>
+            <w:r>
+              <w:rPr>
+                <w:b/>
+                <w:sz w:val="19"/>
+              </w:rPr>
+              <w:t>#</w:t>
+            </w:r>
+          </w:p>
+        </w:tc>
+        <w:tc>
+          <w:tcPr>
+            <w:tcW w:type="dxa" w:w="2664"/>
+          </w:tcPr>
+          <w:p>
+            <w:r>
+              <w:rPr>
+                <w:b/>
+                <w:sz w:val="19"/>
+              </w:rPr>
+              <w:t>Clip</w:t>
+            </w:r>
+          </w:p>
+        </w:tc>
+        <w:tc>
+          <w:tcPr>
+            <w:tcW w:type="dxa" w:w="3096"/>
+          </w:tcPr>
+          <w:p>
+            <w:r>
+              <w:rPr>
+                <w:b/>
+                <w:sz w:val="19"/>
+              </w:rPr>
+              <w:t>Shows</w:t>
+            </w:r>
+          </w:p>
+        </w:tc>
+        <w:tc>
+          <w:tcPr>
+            <w:tcW w:type="dxa" w:w="2376"/>
+          </w:tcPr>
+          <w:p>
+            <w:r>
+              <w:rPr>
+                <w:b/>
+                <w:sz w:val="19"/>
+              </w:rPr>
+              <w:t>In–Out</w:t>
+            </w:r>
+          </w:p>
+        </w:tc>
+        <w:tc>
+          <w:tcPr>
+            <w:tcW w:type="dxa" w:w="1368"/>
+          </w:tcPr>
+          <w:p>
+            <w:r>
+              <w:rPr>
+                <w:b/>
+                <w:sz w:val="19"/>
+              </w:rPr>
+              <w:t>Status</w:t>
+            </w:r>
+          </w:p>
+        </w:tc>
+      </w:tr>
+      <w:tr>
+        <w:tc>
+          <w:tcPr>
+            <w:tcW w:type="dxa" w:w="432"/>
+          </w:tcPr>
+          <w:p>
+            <w:pPr>
+              <w:spacing w:after="40"/>
+            </w:pPr>
+            <w:r>
+              <w:rPr>
+                <w:sz w:val="19"/>
+              </w:rPr>
+              <w:t>2</w:t>
+            </w:r>
+          </w:p>
+        </w:tc>
+        <w:tc>
+          <w:tcPr>
+            <w:tcW w:type="dxa" w:w="2664"/>
+          </w:tcPr>
+          <w:p>
+            <w:pPr>
+              <w:spacing w:after="40"/>
+            </w:pPr>
+            <w:hyperlink r:id="rId9">
+              <w:r>
+                <w:rPr>
+                  <w:color w:val="1155CC"/>
+                  <w:u w:val="single"/>
+                </w:rPr>
+                <w:t xml:space="preserve">ABC News 4 / WCYB — Tennessee grandma mistakenly sent to North Dakota jail due to AI error</w:t>
+              </w:r>
+            </w:hyperlink>
+          </w:p>
+        </w:tc>
+        <w:tc>
+          <w:tcPr>
+            <w:tcW w:type="dxa" w:w="3096"/>
+          </w:tcPr>
+          <w:p>
+            <w:pPr>
+              <w:spacing w:after="40"/>
+            </w:pPr>
+            <w:r>
+              <w:rPr>
+                <w:sz w:val="19"/>
+              </w:rPr>
+              <w:t>Local package: US Marshals at her Carter County house, 50-year-old grandmother of five, a state she'd never visited. Reporter voiceover.</w:t>
+            </w:r>
+          </w:p>
+        </w:tc>
+        <w:tc>
+          <w:tcPr>
+            <w:tcW w:type="dxa" w:w="2376"/>
+          </w:tcPr>
+          <w:p>
+            <w:pPr>
+              <w:spacing w:after="40"/>
+            </w:pPr>
+            <w:r>
+              <w:rPr>
+                <w:sz w:val="19"/>
+              </w:rPr>
+              <w:t>0:16–0:31 "a state she'd never even visited"</w:t>
+            </w:r>
+          </w:p>
+        </w:tc>
+        <w:tc>
+          <w:tcPr>
+            <w:tcW w:type="dxa" w:w="1368"/>
+          </w:tcPr>
+          <w:p>
+            <w:pPr>
+              <w:spacing w:after="40"/>
+            </w:pPr>
+            <w:r>
+              <w:rPr>
+                <w:sz w:val="19"/>
+              </w:rPr>
+              <w:t>WEAK</w:t>
+            </w:r>
+          </w:p>
+        </w:tc>
+      </w:tr>
+      <w:tr>
+        <w:tc>
+          <w:tcPr>
+            <w:tcW w:type="dxa" w:w="432"/>
+          </w:tcPr>
+          <w:p>
+            <w:pPr>
+              <w:spacing w:after="40"/>
+            </w:pPr>
+            <w:r>
+              <w:rPr>
+                <w:sz w:val="19"/>
+              </w:rPr>
+              <w:t>3</w:t>
+            </w:r>
+          </w:p>
+        </w:tc>
+        <w:tc>
+          <w:tcPr>
+            <w:tcW w:type="dxa" w:w="2664"/>
+          </w:tcPr>
+          <w:p>
+            <w:pPr>
+              <w:spacing w:after="40"/>
+            </w:pPr>
+            <w:hyperlink r:id="rId9">
+              <w:r>
+                <w:rPr>
+                  <w:color w:val="1155CC"/>
+                  <w:u w:val="single"/>
+                </w:rPr>
+                <w:t xml:space="preserve">ABC News 4 / WCYB — same package</w:t>
+              </w:r>
+            </w:hyperlink>
+          </w:p>
+        </w:tc>
+        <w:tc>
+          <w:tcPr>
+            <w:tcW w:type="dxa" w:w="3096"/>
+          </w:tcPr>
+          <w:p>
+            <w:pPr>
+              <w:spacing w:after="40"/>
+            </w:pPr>
+            <w:r>
+              <w:rPr>
+                <w:sz w:val="19"/>
+              </w:rPr>
+              <w:t>Attorney Eric Rice: an AI program selected her face and an officer reviewed her social media; then the fake military ID bank fraud.</w:t>
+            </w:r>
+          </w:p>
+        </w:tc>
+        <w:tc>
+          <w:tcPr>
+            <w:tcW w:type="dxa" w:w="2376"/>
+          </w:tcPr>
+          <w:p>
+            <w:pPr>
+              <w:spacing w:after="40"/>
+            </w:pPr>
+            <w:r>
+              <w:rPr>
+                <w:sz w:val="19"/>
+              </w:rPr>
+              <w:t>0:31–0:46 "an arrest warrant to be issued for her" BUTT 0:46–1:00 "between April and May of 2025"</w:t>
+            </w:r>
+          </w:p>
+        </w:tc>
+        <w:tc>
+          <w:tcPr>
+            <w:tcW w:type="dxa" w:w="1368"/>
+          </w:tcPr>
+          <w:p>
+            <w:pPr>
+              <w:spacing w:after="40"/>
+            </w:pPr>
+            <w:r>
+              <w:rPr>
+                <w:sz w:val="19"/>
+              </w:rPr>
+              <w:t>PICK</w:t>
+            </w:r>
+          </w:p>
+        </w:tc>
+      </w:tr>
+      <w:tr>
+        <w:tc>
+          <w:tcPr>
+            <w:tcW w:type="dxa" w:w="432"/>
+          </w:tcPr>
+          <w:p>
+            <w:pPr>
+              <w:spacing w:after="40"/>
+            </w:pPr>
+            <w:r>
+              <w:rPr>
+                <w:sz w:val="19"/>
+              </w:rPr>
+              <w:t>4</w:t>
+            </w:r>
+          </w:p>
+        </w:tc>
+        <w:tc>
+          <w:tcPr>
+            <w:tcW w:type="dxa" w:w="2664"/>
+          </w:tcPr>
+          <w:p>
+            <w:pPr>
+              <w:spacing w:after="40"/>
+            </w:pPr>
+            <w:hyperlink r:id="rId10">
+              <w:r>
+                <w:rPr>
+                  <w:color w:val="1155CC"/>
+                  <w:u w:val="single"/>
+                </w:rPr>
+                <w:t xml:space="preserve">CBS News — Grandmother falsely accused of bank fraud sues Fargo</w:t>
+              </w:r>
+            </w:hyperlink>
+          </w:p>
+        </w:tc>
+        <w:tc>
+          <w:tcPr>
+            <w:tcW w:type="dxa" w:w="3096"/>
+          </w:tcPr>
+          <w:p>
+            <w:pPr>
+              <w:spacing w:after="40"/>
+            </w:pPr>
+            <w:r>
+              <w:rPr>
+                <w:sz w:val="19"/>
+              </w:rPr>
+              <w:t>Correspondent: months behind bars, couldn't make bail, bank records freed her, released Christmas Eve in the clothes she was booked in.</w:t>
+            </w:r>
+          </w:p>
+        </w:tc>
+        <w:tc>
+          <w:tcPr>
+            <w:tcW w:type="dxa" w:w="2376"/>
+          </w:tcPr>
+          <w:p>
+            <w:pPr>
+              <w:spacing w:after="40"/>
+            </w:pPr>
+            <w:r>
+              <w:rPr>
+                <w:sz w:val="19"/>
+              </w:rPr>
+              <w:t>1:16–1:46 "the same clothes she was booked in in July"</w:t>
+            </w:r>
+          </w:p>
+        </w:tc>
+        <w:tc>
+          <w:tcPr>
+            <w:tcW w:type="dxa" w:w="1368"/>
+          </w:tcPr>
+          <w:p>
+            <w:pPr>
+              <w:spacing w:after="40"/>
+            </w:pPr>
+            <w:r>
+              <w:rPr>
+                <w:sz w:val="19"/>
+              </w:rPr>
+              <w:t>PICK</w:t>
+            </w:r>
+          </w:p>
+        </w:tc>
+      </w:tr>
+      <w:tr>
+        <w:tc>
+          <w:tcPr>
+            <w:tcW w:type="dxa" w:w="432"/>
+          </w:tcPr>
+          <w:p>
+            <w:pPr>
+              <w:spacing w:after="40"/>
+            </w:pPr>
+            <w:r>
+              <w:rPr>
+                <w:sz w:val="19"/>
+              </w:rPr>
+              <w:t>5</w:t>
+            </w:r>
+          </w:p>
+        </w:tc>
+        <w:tc>
+          <w:tcPr>
+            <w:tcW w:type="dxa" w:w="2664"/>
+          </w:tcPr>
+          <w:p>
+            <w:pPr>
+              <w:spacing w:after="40"/>
+            </w:pPr>
+            <w:hyperlink r:id="rId11">
+              <w:r>
+                <w:rPr>
+                  <w:color w:val="1155CC"/>
+                  <w:u w:val="single"/>
+                </w:rPr>
+                <w:t xml:space="preserve">KVRR — Fargo Police Chief admits mistakes were made in Lipps case</w:t>
+              </w:r>
+            </w:hyperlink>
+          </w:p>
+        </w:tc>
+        <w:tc>
+          <w:tcPr>
+            <w:tcW w:type="dxa" w:w="3096"/>
+          </w:tcPr>
+          <w:p>
+            <w:pPr>
+              <w:spacing w:after="40"/>
+            </w:pPr>
+            <w:r>
+              <w:rPr>
+                <w:sz w:val="19"/>
+              </w:rPr>
+              <w:t>By title, the chief's admission; transcript not reached (bot wall, two attempts).</w:t>
+            </w:r>
+          </w:p>
+        </w:tc>
+        <w:tc>
+          <w:tcPr>
+            <w:tcW w:type="dxa" w:w="2376"/>
+          </w:tcPr>
+          <w:p>
+            <w:pPr>
+              <w:spacing w:after="40"/>
+            </w:pPr>
+            <w:r>
+              <w:rPr>
+                <w:sz w:val="19"/>
+              </w:rPr>
+              <w:t>—</w:t>
+            </w:r>
+          </w:p>
+        </w:tc>
+        <w:tc>
+          <w:tcPr>
+            <w:tcW w:type="dxa" w:w="1368"/>
+          </w:tcPr>
+          <w:p>
+            <w:pPr>
+              <w:spacing w:after="40"/>
+            </w:pPr>
+            <w:r>
+              <w:rPr>
+                <w:sz w:val="19"/>
+              </w:rPr>
+              <w:t>THROTTLED</w:t>
+            </w:r>
+          </w:p>
+        </w:tc>
+      </w:tr>
+      <w:tr>
+        <w:tc>
+          <w:tcPr>
+            <w:tcW w:type="dxa" w:w="432"/>
+          </w:tcPr>
+          <w:p>
+            <w:pPr>
+              <w:spacing w:after="40"/>
+            </w:pPr>
+            <w:r>
+              <w:rPr>
+                <w:sz w:val="19"/>
+              </w:rPr>
+              <w:t>6</w:t>
+            </w:r>
+          </w:p>
+        </w:tc>
+        <w:tc>
+          <w:tcPr>
+            <w:tcW w:type="dxa" w:w="2664"/>
+          </w:tcPr>
+          <w:p>
+            <w:pPr>
+              <w:spacing w:after="40"/>
+            </w:pPr>
+            <w:hyperlink r:id="rId10">
+              <w:r>
+                <w:rPr>
+                  <w:color w:val="1155CC"/>
+                  <w:u w:val="single"/>
+                </w:rPr>
+                <w:t xml:space="preserve">CBS News — same package</w:t>
+              </w:r>
+            </w:hyperlink>
+          </w:p>
+        </w:tc>
+        <w:tc>
+          <w:tcPr>
+            <w:tcW w:type="dxa" w:w="3096"/>
+          </w:tcPr>
+          <w:p>
+            <w:pPr>
+              <w:spacing w:after="40"/>
+            </w:pPr>
+            <w:r>
+              <w:rPr>
+                <w:sz w:val="19"/>
+              </w:rPr>
+              <w:t>Anchor intro: never set foot in North Dakota, suing Fargo; then the civil-rights and malicious-prosecution claims.</w:t>
+            </w:r>
+          </w:p>
+        </w:tc>
+        <w:tc>
+          <w:tcPr>
+            <w:tcW w:type="dxa" w:w="2376"/>
+          </w:tcPr>
+          <w:p>
+            <w:pPr>
+              <w:spacing w:after="40"/>
+            </w:pPr>
+            <w:r>
+              <w:rPr>
+                <w:sz w:val="19"/>
+              </w:rPr>
+              <w:t>0:00–0:19 "for false arrest" BUTT 0:42–0:57 "what she believes was malicious prosecution"</w:t>
+            </w:r>
+          </w:p>
+        </w:tc>
+        <w:tc>
+          <w:tcPr>
+            <w:tcW w:type="dxa" w:w="1368"/>
+          </w:tcPr>
+          <w:p>
+            <w:pPr>
+              <w:spacing w:after="40"/>
+            </w:pPr>
+            <w:r>
+              <w:rPr>
+                <w:sz w:val="19"/>
+              </w:rPr>
+              <w:t>PICK</w:t>
+            </w:r>
+          </w:p>
+        </w:tc>
+      </w:tr>
+    </w:tbl>
+    <w:p/>
+    <w:p>
+      <w:r>
+        <w:rPr>
+          <w:i/>
+        </w:rPr>
+        <w:t>Row 2: no Lipps soundbite in any transcript reached. Rows 4 and 6: CBS says "Lipscomb" at 0:32 and 1:08, outside both segments.</w:t>
+      </w:r>
+    </w:p>
+    <w:p>
+      <w:pPr>
+        <w:pStyle w:val="Heading3"/>
+      </w:pPr>
+      <w:r>
+        <w:rPr>
+          <w:color w:val="333333"/>
+          <w:sz w:val="22"/>
+        </w:rPr>
         <w:t>The fix</w:t>
       </w:r>
     </w:p>
@@ -2075,6 +2618,370 @@
           <w:color w:val="333333"/>
           <w:sz w:val="22"/>
         </w:rPr>
+        <w:t>Videos</w:t>
+      </w:r>
+    </w:p>
+    <w:tbl>
+      <w:tblPr>
+        <w:tblStyle w:val="TableGrid"/>
+        <w:tblW w:type="auto" w:w="0"/>
+        <w:jc w:val="center"/>
+        <w:tblLayout w:type="fixed"/>
+        <w:tblLook w:firstColumn="1" w:firstRow="1" w:lastColumn="0" w:lastRow="0" w:noHBand="0" w:noVBand="1" w:val="04A0"/>
+      </w:tblPr>
+      <w:tblGrid>
+        <w:gridCol w:w="432"/>
+        <w:gridCol w:w="2664"/>
+        <w:gridCol w:w="3096"/>
+        <w:gridCol w:w="2376"/>
+        <w:gridCol w:w="1368"/>
+      </w:tblGrid>
+      <w:tr>
+        <w:tc>
+          <w:tcPr>
+            <w:tcW w:type="dxa" w:w="432"/>
+          </w:tcPr>
+          <w:p>
+            <w:r>
+              <w:rPr>
+                <w:b/>
+                <w:sz w:val="19"/>
+              </w:rPr>
+              <w:t>#</w:t>
+            </w:r>
+          </w:p>
+        </w:tc>
+        <w:tc>
+          <w:tcPr>
+            <w:tcW w:type="dxa" w:w="2664"/>
+          </w:tcPr>
+          <w:p>
+            <w:r>
+              <w:rPr>
+                <w:b/>
+                <w:sz w:val="19"/>
+              </w:rPr>
+              <w:t>Clip</w:t>
+            </w:r>
+          </w:p>
+        </w:tc>
+        <w:tc>
+          <w:tcPr>
+            <w:tcW w:type="dxa" w:w="3096"/>
+          </w:tcPr>
+          <w:p>
+            <w:r>
+              <w:rPr>
+                <w:b/>
+                <w:sz w:val="19"/>
+              </w:rPr>
+              <w:t>Shows</w:t>
+            </w:r>
+          </w:p>
+        </w:tc>
+        <w:tc>
+          <w:tcPr>
+            <w:tcW w:type="dxa" w:w="2376"/>
+          </w:tcPr>
+          <w:p>
+            <w:r>
+              <w:rPr>
+                <w:b/>
+                <w:sz w:val="19"/>
+              </w:rPr>
+              <w:t>In–Out</w:t>
+            </w:r>
+          </w:p>
+        </w:tc>
+        <w:tc>
+          <w:tcPr>
+            <w:tcW w:type="dxa" w:w="1368"/>
+          </w:tcPr>
+          <w:p>
+            <w:r>
+              <w:rPr>
+                <w:b/>
+                <w:sz w:val="19"/>
+              </w:rPr>
+              <w:t>Status</w:t>
+            </w:r>
+          </w:p>
+        </w:tc>
+      </w:tr>
+      <w:tr>
+        <w:tc>
+          <w:tcPr>
+            <w:tcW w:type="dxa" w:w="432"/>
+          </w:tcPr>
+          <w:p>
+            <w:pPr>
+              <w:spacing w:after="40"/>
+            </w:pPr>
+            <w:r>
+              <w:rPr>
+                <w:sz w:val="19"/>
+              </w:rPr>
+              <w:t>1</w:t>
+            </w:r>
+          </w:p>
+        </w:tc>
+        <w:tc>
+          <w:tcPr>
+            <w:tcW w:type="dxa" w:w="2664"/>
+          </w:tcPr>
+          <w:p>
+            <w:pPr>
+              <w:spacing w:after="40"/>
+            </w:pPr>
+            <w:hyperlink r:id="rId12">
+              <w:r>
+                <w:rPr>
+                  <w:color w:val="1155CC"/>
+                  <w:u w:val="single"/>
+                </w:rPr>
+                <w:t xml:space="preserve">Instacart — Meet Caper Cart</w:t>
+              </w:r>
+            </w:hyperlink>
+          </w:p>
+        </w:tc>
+        <w:tc>
+          <w:tcPr>
+            <w:tcW w:type="dxa" w:w="3096"/>
+          </w:tcPr>
+          <w:p>
+            <w:pPr>
+              <w:spacing w:after="40"/>
+            </w:pPr>
+            <w:r>
+              <w:rPr>
+                <w:sz w:val="19"/>
+              </w:rPr>
+              <w:t>The cart in an aisle, items dropped in, computer-vision cameras, then location-based deals and personalized ads.</w:t>
+            </w:r>
+          </w:p>
+        </w:tc>
+        <w:tc>
+          <w:tcPr>
+            <w:tcW w:type="dxa" w:w="2376"/>
+          </w:tcPr>
+          <w:p>
+            <w:pPr>
+              <w:spacing w:after="40"/>
+            </w:pPr>
+            <w:r>
+              <w:rPr>
+                <w:sz w:val="19"/>
+              </w:rPr>
+              <w:t>0:00–0:43 "them and even add them back" BUTT 0:48–1:08 "your customer's"</w:t>
+            </w:r>
+          </w:p>
+        </w:tc>
+        <w:tc>
+          <w:tcPr>
+            <w:tcW w:type="dxa" w:w="1368"/>
+          </w:tcPr>
+          <w:p>
+            <w:pPr>
+              <w:spacing w:after="40"/>
+            </w:pPr>
+            <w:r>
+              <w:rPr>
+                <w:sz w:val="19"/>
+              </w:rPr>
+              <w:t>PICK · CROP</w:t>
+            </w:r>
+          </w:p>
+        </w:tc>
+      </w:tr>
+      <w:tr>
+        <w:tc>
+          <w:tcPr>
+            <w:tcW w:type="dxa" w:w="432"/>
+          </w:tcPr>
+          <w:p>
+            <w:pPr>
+              <w:spacing w:after="40"/>
+            </w:pPr>
+            <w:r>
+              <w:rPr>
+                <w:sz w:val="19"/>
+              </w:rPr>
+              <w:t>2</w:t>
+            </w:r>
+          </w:p>
+        </w:tc>
+        <w:tc>
+          <w:tcPr>
+            <w:tcW w:type="dxa" w:w="2664"/>
+          </w:tcPr>
+          <w:p>
+            <w:pPr>
+              <w:spacing w:after="40"/>
+            </w:pPr>
+            <w:hyperlink r:id="rId13">
+              <w:r>
+                <w:rPr>
+                  <w:color w:val="1155CC"/>
+                  <w:u w:val="single"/>
+                </w:rPr>
+                <w:t xml:space="preserve">@user60342208753 — Target basket tracker</w:t>
+              </w:r>
+            </w:hyperlink>
+          </w:p>
+        </w:tc>
+        <w:tc>
+          <w:tcPr>
+            <w:tcW w:type="dxa" w:w="3096"/>
+          </w:tcPr>
+          <w:p>
+            <w:pPr>
+              <w:spacing w:after="40"/>
+            </w:pPr>
+            <w:r>
+              <w:rPr>
+                <w:sz w:val="19"/>
+              </w:rPr>
+              <w:t>Store worker calls the box on a basket a tracker, per caption and press write-up. Posted Aug 29.</w:t>
+            </w:r>
+          </w:p>
+        </w:tc>
+        <w:tc>
+          <w:tcPr>
+            <w:tcW w:type="dxa" w:w="2376"/>
+          </w:tcPr>
+          <w:p>
+            <w:pPr>
+              <w:spacing w:after="40"/>
+            </w:pPr>
+            <w:r>
+              <w:rPr>
+                <w:sz w:val="19"/>
+              </w:rPr>
+              <w:t>—</w:t>
+            </w:r>
+          </w:p>
+        </w:tc>
+        <w:tc>
+          <w:tcPr>
+            <w:tcW w:type="dxa" w:w="1368"/>
+          </w:tcPr>
+          <w:p>
+            <w:pPr>
+              <w:spacing w:after="40"/>
+            </w:pPr>
+            <w:r>
+              <w:rPr>
+                <w:sz w:val="19"/>
+              </w:rPr>
+              <w:t>MANUAL · UNVERIFIED</w:t>
+            </w:r>
+          </w:p>
+        </w:tc>
+      </w:tr>
+      <w:tr>
+        <w:tc>
+          <w:tcPr>
+            <w:tcW w:type="dxa" w:w="432"/>
+          </w:tcPr>
+          <w:p>
+            <w:pPr>
+              <w:spacing w:after="40"/>
+            </w:pPr>
+            <w:r>
+              <w:rPr>
+                <w:sz w:val="19"/>
+              </w:rPr>
+              <w:t>3</w:t>
+            </w:r>
+          </w:p>
+        </w:tc>
+        <w:tc>
+          <w:tcPr>
+            <w:tcW w:type="dxa" w:w="2664"/>
+          </w:tcPr>
+          <w:p>
+            <w:pPr>
+              <w:spacing w:after="40"/>
+            </w:pPr>
+            <w:hyperlink r:id="rId14">
+              <w:r>
+                <w:rPr>
+                  <w:color w:val="1155CC"/>
+                  <w:u w:val="single"/>
+                </w:rPr>
+                <w:t xml:space="preserve">NBC Connecticut — License plate readers now at Home Depot, Lowe's</w:t>
+              </w:r>
+            </w:hyperlink>
+          </w:p>
+        </w:tc>
+        <w:tc>
+          <w:tcPr>
+            <w:tcW w:type="dxa" w:w="3096"/>
+          </w:tcPr>
+          <w:p>
+            <w:pPr>
+              <w:spacing w:after="40"/>
+            </w:pPr>
+            <w:r>
+              <w:rPr>
+                <w:sz w:val="19"/>
+              </w:rPr>
+              <w:t>Plate cameras at a Lowe's entrance in Newington, CT, then a professor on oversight and data retention.</w:t>
+            </w:r>
+          </w:p>
+        </w:tc>
+        <w:tc>
+          <w:tcPr>
+            <w:tcW w:type="dxa" w:w="2376"/>
+          </w:tcPr>
+          <w:p>
+            <w:pPr>
+              <w:spacing w:after="40"/>
+            </w:pPr>
+            <w:r>
+              <w:rPr>
+                <w:sz w:val="19"/>
+              </w:rPr>
+              <w:t>0:17–0:51 "now using them to prevent theft. It's an" BUTT 1:22–1:37 "accountability, data retention."</w:t>
+            </w:r>
+          </w:p>
+        </w:tc>
+        <w:tc>
+          <w:tcPr>
+            <w:tcW w:type="dxa" w:w="1368"/>
+          </w:tcPr>
+          <w:p>
+            <w:pPr>
+              <w:spacing w:after="40"/>
+            </w:pPr>
+            <w:r>
+              <w:rPr>
+                <w:sz w:val="19"/>
+              </w:rPr>
+              <w:t>PICK</w:t>
+            </w:r>
+          </w:p>
+        </w:tc>
+      </w:tr>
+    </w:tbl>
+    <w:p/>
+    <w:p>
+      <w:r>
+        <w:rPr>
+          <w:i/>
+        </w:rPr>
+        <w:t>Rows 1 and 3 reused from run LIVE_10072026 and re-verified against captions this run. Row 2: no caption track, and media downloads blocked, so no Whisper.</w:t>
+      </w:r>
+    </w:p>
+    <w:p>
+      <w:pPr>
+        <w:pStyle w:val="Heading3"/>
+      </w:pPr>
+      <w:r>
+        <w:rPr>
+          <w:color w:val="333333"/>
+          <w:sz w:val="22"/>
+        </w:rPr>
         <w:t>The fix</w:t>
       </w:r>
     </w:p>
@@ -2129,7 +3036,7 @@
         <w:spacing w:after="40"/>
       </w:pPr>
       <w:r>
-        <w:t>⚠️ Beat 2 is Target's basket. Jeff wants the story off Target: keep the clip without naming the brand in copy, or drop it (see Decisions).</w:t>
+        <w:t>⚠️ Beat 2 is Target's basket. Kept (producer, 9/29): it went viral, but don't lean on the brand in copy.</w:t>
       </w:r>
     </w:p>
     <w:p>
@@ -2635,6 +3542,385 @@
           <w:color w:val="333333"/>
           <w:sz w:val="22"/>
         </w:rPr>
+        <w:t>Videos</w:t>
+      </w:r>
+    </w:p>
+    <w:tbl>
+      <w:tblPr>
+        <w:tblStyle w:val="TableGrid"/>
+        <w:tblW w:type="auto" w:w="0"/>
+        <w:jc w:val="center"/>
+        <w:tblLayout w:type="fixed"/>
+        <w:tblLook w:firstColumn="1" w:firstRow="1" w:lastColumn="0" w:lastRow="0" w:noHBand="0" w:noVBand="1" w:val="04A0"/>
+      </w:tblPr>
+      <w:tblGrid>
+        <w:gridCol w:w="432"/>
+        <w:gridCol w:w="2664"/>
+        <w:gridCol w:w="3096"/>
+        <w:gridCol w:w="2376"/>
+        <w:gridCol w:w="1368"/>
+      </w:tblGrid>
+      <w:tr>
+        <w:tc>
+          <w:tcPr>
+            <w:tcW w:type="dxa" w:w="432"/>
+          </w:tcPr>
+          <w:p>
+            <w:r>
+              <w:rPr>
+                <w:b/>
+                <w:sz w:val="19"/>
+              </w:rPr>
+              <w:t>#</w:t>
+            </w:r>
+          </w:p>
+        </w:tc>
+        <w:tc>
+          <w:tcPr>
+            <w:tcW w:type="dxa" w:w="2664"/>
+          </w:tcPr>
+          <w:p>
+            <w:r>
+              <w:rPr>
+                <w:b/>
+                <w:sz w:val="19"/>
+              </w:rPr>
+              <w:t>Clip</w:t>
+            </w:r>
+          </w:p>
+        </w:tc>
+        <w:tc>
+          <w:tcPr>
+            <w:tcW w:type="dxa" w:w="3096"/>
+          </w:tcPr>
+          <w:p>
+            <w:r>
+              <w:rPr>
+                <w:b/>
+                <w:sz w:val="19"/>
+              </w:rPr>
+              <w:t>Shows</w:t>
+            </w:r>
+          </w:p>
+        </w:tc>
+        <w:tc>
+          <w:tcPr>
+            <w:tcW w:type="dxa" w:w="2376"/>
+          </w:tcPr>
+          <w:p>
+            <w:r>
+              <w:rPr>
+                <w:b/>
+                <w:sz w:val="19"/>
+              </w:rPr>
+              <w:t>In–Out</w:t>
+            </w:r>
+          </w:p>
+        </w:tc>
+        <w:tc>
+          <w:tcPr>
+            <w:tcW w:type="dxa" w:w="1368"/>
+          </w:tcPr>
+          <w:p>
+            <w:r>
+              <w:rPr>
+                <w:b/>
+                <w:sz w:val="19"/>
+              </w:rPr>
+              <w:t>Status</w:t>
+            </w:r>
+          </w:p>
+        </w:tc>
+      </w:tr>
+      <w:tr>
+        <w:tc>
+          <w:tcPr>
+            <w:tcW w:type="dxa" w:w="432"/>
+          </w:tcPr>
+          <w:p>
+            <w:pPr>
+              <w:spacing w:after="40"/>
+            </w:pPr>
+            <w:r>
+              <w:rPr>
+                <w:sz w:val="19"/>
+              </w:rPr>
+              <w:t>1</w:t>
+            </w:r>
+          </w:p>
+        </w:tc>
+        <w:tc>
+          <w:tcPr>
+            <w:tcW w:type="dxa" w:w="2664"/>
+          </w:tcPr>
+          <w:p>
+            <w:pPr>
+              <w:spacing w:after="40"/>
+            </w:pPr>
+            <w:hyperlink r:id="rId15">
+              <w:r>
+                <w:rPr>
+                  <w:color w:val="1155CC"/>
+                  <w:u w:val="single"/>
+                </w:rPr>
+                <w:t xml:space="preserve">@typical_redhead_ — This McDonald's robot is wild</w:t>
+              </w:r>
+            </w:hyperlink>
+            <w:r>
+              <w:rPr>
+                <w:sz w:val="19"/>
+              </w:rPr>
+              <w:t xml:space="preserve"> · alt: </w:t>
+            </w:r>
+            <w:hyperlink r:id="rId16">
+              <w:r>
+                <w:rPr>
+                  <w:color w:val="1155CC"/>
+                  <w:u w:val="single"/>
+                </w:rPr>
+                <w:t xml:space="preserve">@kristinealise — Taco Bell "one thousand waters"</w:t>
+              </w:r>
+            </w:hyperlink>
+          </w:p>
+        </w:tc>
+        <w:tc>
+          <w:tcPr>
+            <w:tcW w:type="dxa" w:w="3096"/>
+          </w:tcPr>
+          <w:p>
+            <w:pPr>
+              <w:spacing w:after="40"/>
+            </w:pPr>
+            <w:r>
+              <w:rPr>
+                <w:sz w:val="19"/>
+              </w:rPr>
+              <w:t>McDonald's AI keeps adding McNuggets, 28 orders deep (Jan 2023, per TODAY). Alt: Taco Bell AI hands the car to a human (Jul 2025, per Daily Dot). Call later.</w:t>
+            </w:r>
+          </w:p>
+        </w:tc>
+        <w:tc>
+          <w:tcPr>
+            <w:tcW w:type="dxa" w:w="2376"/>
+          </w:tcPr>
+          <w:p>
+            <w:pPr>
+              <w:spacing w:after="40"/>
+            </w:pPr>
+            <w:r>
+              <w:rPr>
+                <w:sz w:val="19"/>
+              </w:rPr>
+              <w:t>—</w:t>
+            </w:r>
+          </w:p>
+        </w:tc>
+        <w:tc>
+          <w:tcPr>
+            <w:tcW w:type="dxa" w:w="1368"/>
+          </w:tcPr>
+          <w:p>
+            <w:pPr>
+              <w:spacing w:after="40"/>
+            </w:pPr>
+            <w:r>
+              <w:rPr>
+                <w:sz w:val="19"/>
+              </w:rPr>
+              <w:t>MANUAL · UNVERIFIED</w:t>
+            </w:r>
+          </w:p>
+        </w:tc>
+      </w:tr>
+      <w:tr>
+        <w:tc>
+          <w:tcPr>
+            <w:tcW w:type="dxa" w:w="432"/>
+          </w:tcPr>
+          <w:p>
+            <w:pPr>
+              <w:spacing w:after="40"/>
+            </w:pPr>
+            <w:r>
+              <w:rPr>
+                <w:sz w:val="19"/>
+              </w:rPr>
+              <w:t>2</w:t>
+            </w:r>
+          </w:p>
+        </w:tc>
+        <w:tc>
+          <w:tcPr>
+            <w:tcW w:type="dxa" w:w="2664"/>
+          </w:tcPr>
+          <w:p>
+            <w:pPr>
+              <w:spacing w:after="40"/>
+            </w:pPr>
+            <w:hyperlink r:id="rId17">
+              <w:r>
+                <w:rPr>
+                  <w:color w:val="1155CC"/>
+                  <w:u w:val="single"/>
+                </w:rPr>
+                <w:t xml:space="preserve">NBC News — Burger King's new AI chatbot to improve 'friendliness'</w:t>
+              </w:r>
+            </w:hyperlink>
+          </w:p>
+        </w:tc>
+        <w:tc>
+          <w:tcPr>
+            <w:tcW w:type="dxa" w:w="3096"/>
+          </w:tcPr>
+          <w:p>
+            <w:pPr>
+              <w:spacing w:after="40"/>
+            </w:pPr>
+            <w:r>
+              <w:rPr>
+                <w:sz w:val="19"/>
+              </w:rPr>
+              <w:t>Burger King's AI headset; "hospitality is fundamentally human," then AI drive-thru chatbots "aren't quite there yet" with a customer glitch.</w:t>
+            </w:r>
+          </w:p>
+        </w:tc>
+        <w:tc>
+          <w:tcPr>
+            <w:tcW w:type="dxa" w:w="2376"/>
+          </w:tcPr>
+          <w:p>
+            <w:pPr>
+              <w:spacing w:after="40"/>
+            </w:pPr>
+            <w:r>
+              <w:rPr>
+                <w:sz w:val="19"/>
+              </w:rPr>
+              <w:t>1:11–1:16 "hospitality is fundamentally human" BUTT 1:24–1:44 "AI, please remove that item"</w:t>
+            </w:r>
+          </w:p>
+        </w:tc>
+        <w:tc>
+          <w:tcPr>
+            <w:tcW w:type="dxa" w:w="1368"/>
+          </w:tcPr>
+          <w:p>
+            <w:pPr>
+              <w:spacing w:after="40"/>
+            </w:pPr>
+            <w:r>
+              <w:rPr>
+                <w:sz w:val="19"/>
+              </w:rPr>
+              <w:t>WEAK</w:t>
+            </w:r>
+          </w:p>
+        </w:tc>
+      </w:tr>
+      <w:tr>
+        <w:tc>
+          <w:tcPr>
+            <w:tcW w:type="dxa" w:w="432"/>
+          </w:tcPr>
+          <w:p>
+            <w:pPr>
+              <w:spacing w:after="40"/>
+            </w:pPr>
+            <w:r>
+              <w:rPr>
+                <w:sz w:val="19"/>
+              </w:rPr>
+              <w:t>3</w:t>
+            </w:r>
+          </w:p>
+        </w:tc>
+        <w:tc>
+          <w:tcPr>
+            <w:tcW w:type="dxa" w:w="2664"/>
+          </w:tcPr>
+          <w:p>
+            <w:pPr>
+              <w:spacing w:after="40"/>
+            </w:pPr>
+            <w:hyperlink r:id="rId18">
+              <w:r>
+                <w:rPr>
+                  <w:color w:val="1155CC"/>
+                  <w:u w:val="single"/>
+                </w:rPr>
+                <w:t xml:space="preserve">Ecomix Simple — McDonald's Is Retraining 2 Million Workers</w:t>
+              </w:r>
+            </w:hyperlink>
+          </w:p>
+        </w:tc>
+        <w:tc>
+          <w:tcPr>
+            <w:tcW w:type="dxa" w:w="3096"/>
+          </w:tcPr>
+          <w:p>
+            <w:pPr>
+              <w:spacing w:after="40"/>
+            </w:pPr>
+            <w:r>
+              <w:rPr>
+                <w:sz w:val="19"/>
+              </w:rPr>
+              <w:t>Narrated explainer: Oct 5, retraining 2 million-plus people "not on the app, on hospitality." Tiny channel, voice may be synthetic.</w:t>
+            </w:r>
+          </w:p>
+        </w:tc>
+        <w:tc>
+          <w:tcPr>
+            <w:tcW w:type="dxa" w:w="2376"/>
+          </w:tcPr>
+          <w:p>
+            <w:pPr>
+              <w:spacing w:after="40"/>
+            </w:pPr>
+            <w:r>
+              <w:rPr>
+                <w:sz w:val="19"/>
+              </w:rPr>
+              <w:t>0:16–0:29 "Not on the app. On hospitality."</w:t>
+            </w:r>
+          </w:p>
+        </w:tc>
+        <w:tc>
+          <w:tcPr>
+            <w:tcW w:type="dxa" w:w="1368"/>
+          </w:tcPr>
+          <w:p>
+            <w:pPr>
+              <w:spacing w:after="40"/>
+            </w:pPr>
+            <w:r>
+              <w:rPr>
+                <w:sz w:val="19"/>
+              </w:rPr>
+              <w:t>WEAK</w:t>
+            </w:r>
+          </w:p>
+        </w:tc>
+      </w:tr>
+    </w:tbl>
+    <w:p/>
+    <w:p>
+      <w:r>
+        <w:rPr>
+          <w:i/>
+        </w:rPr>
+        <w:t>Row 1: native TikToks; no captions and no Whisper this run. Rows 2–3: graphic fallback per producer if these don't hold up.</w:t>
+      </w:r>
+    </w:p>
+    <w:p>
+      <w:pPr>
+        <w:pStyle w:val="Heading3"/>
+      </w:pPr>
+      <w:r>
+        <w:rPr>
+          <w:color w:val="333333"/>
+          <w:sz w:val="22"/>
+        </w:rPr>
         <w:t>The fix</w:t>
       </w:r>
     </w:p>

</xml_diff>

<commit_message>
W 10-07: rework A story to 'The camera said it was you' (Lipps, Isaacs, Elser); outline back to Stage: beats, Checkpoint 1
Co-Authored-By: Claude Opus 5.5 <noreply@anthropic.com>
Claude-Session: https://claude.ai/code/session_01F5T5EfKU7bvTfCbU31zr39
</commit_message>
<xml_diff>
--- a/runs/W_10072026/10_07_OUTLINE_WED.docx
+++ b/runs/W_10072026/10_07_OUTLINE_WED.docx
@@ -30,7 +30,7 @@
         <w:t>Stories:</w:t>
       </w:r>
       <w:r>
-        <w:t xml:space="preserve"> A + B + C, confirmed by the producer 9/29 (jeff_approval.md) · </w:t>
+        <w:t xml:space="preserve"> A + B + C, confirmed by the producer 9/29 (jeff_approval.md); A reworked 9/29 · </w:t>
       </w:r>
       <w:r>
         <w:rPr>
@@ -57,7 +57,7 @@
         <w:t>Stage:</w:t>
       </w:r>
       <w:r>
-        <w:t xml:space="preserve"> videos</w:t>
+        <w:t xml:space="preserve"> beats · B and C clips carry over from 9/29</w:t>
       </w:r>
     </w:p>
     <w:p>
@@ -173,7 +173,7 @@
               <w:rPr>
                 <w:sz w:val="19"/>
               </w:rPr>
-              <w:t>Face-match arrest, the grocery cart watching you, the drive-thru robot backlash</w:t>
+              <w:t>The camera said it was you, the grocery cart watching you, the drive-thru robot backlash</w:t>
             </w:r>
           </w:p>
         </w:tc>
@@ -239,7 +239,7 @@
               <w:rPr>
                 <w:sz w:val="19"/>
               </w:rPr>
-              <w:t>A computer said it was her face… she spent months in jail</w:t>
+              <w:t>The camera said it was you… and your phone may be deleting the proof it wasn't</w:t>
             </w:r>
           </w:p>
         </w:tc>
@@ -255,7 +255,7 @@
               <w:rPr>
                 <w:sz w:val="19"/>
               </w:rPr>
-              <w:t>~45% of show</w:t>
+              <w:t>~50% of show</w:t>
             </w:r>
           </w:p>
         </w:tc>
@@ -271,7 +271,7 @@
               <w:rPr>
                 <w:sz w:val="19"/>
               </w:rPr>
-              <w:t>4/5</w:t>
+              <w:t>7</w:t>
             </w:r>
           </w:p>
         </w:tc>
@@ -403,7 +403,7 @@
               <w:rPr>
                 <w:sz w:val="19"/>
               </w:rPr>
-              <w:t>3/3</w:t>
+              <w:t>3</w:t>
             </w:r>
           </w:p>
         </w:tc>
@@ -535,7 +535,7 @@
               <w:rPr>
                 <w:sz w:val="19"/>
               </w:rPr>
-              <w:t>3/3</w:t>
+              <w:t>3</w:t>
             </w:r>
           </w:p>
         </w:tc>
@@ -622,7 +622,7 @@
     </w:p>
     <w:p>
       <w:r>
-        <w:t>A computer matched a Tennessee grandmother's face to a bank thief in a state she'd never been to, and she sat in jail for months before anyone checked. The same kind of watching is in your grocery store: carts with cameras, baskets that ping the ceiling, cameras that log your aisles and your plate. Then the exhale: the fast-food chains are admitting you hated the robots and are bringing people back, and here is how to get one.</w:t>
+        <w:t>A face match, a plate reader and a police sergeant each said a camera proved it was her, and three innocent women paid for it with jail time or a court summons until their own records cleared them. The same kind of watching is in your grocery store: carts with cameras, baskets that ping the ceiling, cameras that log your aisles and your plate. Then the exhale: the fast-food chains are admitting you hated the robots and are bringing people back, and here is how to get one.</w:t>
       </w:r>
     </w:p>
     <w:p>
@@ -639,7 +639,7 @@
     </w:p>
     <w:p>
       <w:r>
-        <w:t>Dread builds through A (arrested at gunpoint, months inside, nobody checked), stays uneasy through B but turns practical at the phone fix, and lets go in C, which is a good-news, slightly funny close.</w:t>
+        <w:t>Dread builds through A's first two women (gunpoint, 108 days, 86 hours behind a shut door), eases when Chrisanna Elser beats the sergeant with her own car's cameras, and lands on a fix Jeff does live; B stays uneasy but practical, and C closes light.</w:t>
       </w:r>
     </w:p>
     <w:p>
@@ -660,7 +660,7 @@
         <w:spacing w:after="40"/>
       </w:pPr>
       <w:r>
-        <w:t>A beat 2 is WEAK (reporter VO; no clip of Lipps speaking) and A beat 5 is THROTTLED (right clip, captions bot-walled). Retry both in a fresh session.</w:t>
+        <w:t>A beats 5–8 (Isaacs, Elser) are new and not yet searched. Beats 2–4 reuse the 9/29 Lipps clips (A beat 2 WEAK). The Fargo chief's apology is now only an alt for A beat 3.</w:t>
       </w:r>
     </w:p>
     <w:p>
@@ -669,7 +669,7 @@
         <w:spacing w:after="40"/>
       </w:pPr>
       <w:r>
-        <w:t>🚨 CBS misnames her "Lipscomb" on air, twice; A beats 4 and 6 avoid both. Outlets also differ on jail time (6 months vs 2 in North Dakota) and on which image was searched. Settle from the complaint.</w:t>
+        <w:t>🚨 Flock was ruled overdone, and a scan shows Elser's case was a Flock hit too, so two of three women are Flock cases. Keep the brand, or say "a license-plate camera"?</w:t>
       </w:r>
     </w:p>
     <w:p>
@@ -678,7 +678,7 @@
         <w:spacing w:after="40"/>
       </w:pPr>
       <w:r>
-        <w:t>A's fix is Jeff showing the location history already on his phone; say on air that keeping it on is a privacy trade-off. Lipps is 50, just under 55+.</w:t>
+        <w:t>A says keep your location history; B says turn location off for store apps. Both can air, but Jeff says plainly that the history can also be subpoenaed.</w:t>
       </w:r>
     </w:p>
     <w:p>
@@ -687,7 +687,7 @@
         <w:spacing w:after="40"/>
       </w:pPr>
       <w:r>
-        <w:t>B beat 2 stays (viral, but don't lean on Target). B beat 1 is a CROP (horizontal promo). B beat 3 has no person, just Lowe's own privacy statement.</w:t>
+        <w:t>B beat 2 (Target basket): the rework note says cut it; the producer ruled 9/29 to keep it. Not cut. Your call.</w:t>
       </w:r>
     </w:p>
     <w:p>
@@ -696,7 +696,7 @@
         <w:spacing w:after="40"/>
       </w:pPr>
       <w:r>
-        <w:t>C beat 1: two TikToks pulled (McDonald's McNuggets, Taco Bell "one thousand waters"); call later. C beat 2 and C beat 3 are WEAK; graphic fallback per producer. Frame C as "bringing the humans back."</w:t>
+        <w:t>Google's default auto-delete is unverified. Jeff says "check yours." Lipps is 50, under 55+.</w:t>
       </w:r>
     </w:p>
     <w:p>
@@ -713,7 +713,7 @@
           <w:color w:val="000000"/>
           <w:sz w:val="32"/>
         </w:rPr>
-        <w:t>A. A COMPUTER SAID IT WAS HER FACE… SHE SPENT MONTHS IN JAIL</w:t>
+        <w:t>A. THE CAMERA SAID IT WAS YOU… AND YOUR PHONE MAY BE DELETING THE PROOF IT WASN'T</w:t>
       </w:r>
     </w:p>
     <w:p>
@@ -724,7 +724,7 @@
         <w:t>In one sentence:</w:t>
       </w:r>
       <w:r>
-        <w:t xml:space="preserve"> Police ran a fake-ID photo through AI face recognition, it returned a Tennessee grandmother who had never been to North Dakota, and she sat in jail for months until her own bank records freed her.</w:t>
+        <w:t xml:space="preserve"> A face-recognition match, a plate-reader hit and a sergeant's "you know why I'm here" put three innocent women in jail or in court, records cleared all three, and the location history on your phone may be deleting yours on a timer.</w:t>
       </w:r>
     </w:p>
     <w:p>
@@ -735,7 +735,7 @@
         <w:t>Peg:</w:t>
       </w:r>
       <w:r>
-        <w:t xml:space="preserve"> She filed a $10 million federal lawsuit against Fargo and the detective on Sept 16; CBS, ABC and NBC picked it up that week.</w:t>
+        <w:t xml:space="preserve"> Angela Lipps filed a $10 million suit Sept 15; Lindsey Isaacs testified at a U.S. Senate hearing Sept 23.</w:t>
       </w:r>
     </w:p>
     <w:p>
@@ -746,7 +746,7 @@
         <w:t>Weight:</w:t>
       </w:r>
       <w:r>
-        <w:t xml:space="preserve"> ~45% of show · 5 clip beats</w:t>
+        <w:t xml:space="preserve"> ~50% of show · 7 clip beats</w:t>
       </w:r>
     </w:p>
     <w:tbl>
@@ -897,7 +897,7 @@
               <w:rPr>
                 <w:sz w:val="19"/>
               </w:rPr>
-              <w:t>Police can run your face through a computer, and a match can be treated like proof.</w:t>
+              <w:t>A camera or computer says it's you, police treat it as proof, and 16 people are known jailed on face-match misses alone.</w:t>
             </w:r>
           </w:p>
         </w:tc>
@@ -947,7 +947,7 @@
               <w:rPr>
                 <w:sz w:val="19"/>
               </w:rPr>
-              <w:t>The arrest</w:t>
+              <w:t>Arrested at gunpoint</w:t>
             </w:r>
           </w:p>
         </w:tc>
@@ -963,7 +963,7 @@
               <w:rPr>
                 <w:sz w:val="19"/>
               </w:rPr>
-              <w:t>Angela Lipps, Tennessee grandmother of five</w:t>
+              <w:t>Angela Lipps, 50, Elizabethton, Tennessee</w:t>
             </w:r>
           </w:p>
         </w:tc>
@@ -979,7 +979,7 @@
               <w:rPr>
                 <w:sz w:val="19"/>
               </w:rPr>
-              <w:t>Police arrest her while she is babysitting, for bank fraud in North Dakota, a state she has never been to.</w:t>
+              <w:t>Police arrest her in July 2025 while she cares for a neighbor's four kids, for bank fraud in North Dakota.</w:t>
             </w:r>
           </w:p>
         </w:tc>
@@ -995,7 +995,22 @@
               <w:rPr>
                 <w:sz w:val="19"/>
               </w:rPr>
-              <w:t>FIND · HORIZONTAL — Lipps interview, WDAY or network</w:t>
+              <w:t xml:space="preserve">HAVE · HORIZONTAL — </w:t>
+            </w:r>
+            <w:hyperlink r:id="rId9">
+              <w:r>
+                <w:rPr>
+                  <w:color w:val="1155CC"/>
+                  <w:u w:val="single"/>
+                </w:rPr>
+                <w:t xml:space="preserve">ABC News 4 / WCYB</w:t>
+              </w:r>
+            </w:hyperlink>
+            <w:r>
+              <w:rPr>
+                <w:sz w:val="19"/>
+              </w:rPr>
+              <w:t xml:space="preserve"> (9/29 WEAK); want Lipps herself on WDAY</w:t>
             </w:r>
           </w:p>
         </w:tc>
@@ -1045,7 +1060,7 @@
               <w:rPr>
                 <w:sz w:val="19"/>
               </w:rPr>
-              <w:t>West Fargo police investigator</w:t>
+              <w:t>Former Fargo detective, named in her suit</w:t>
             </w:r>
           </w:p>
         </w:tc>
@@ -1061,7 +1076,7 @@
               <w:rPr>
                 <w:sz w:val="19"/>
               </w:rPr>
-              <w:t>A photo from the real suspect's fake ID goes into AI face recognition, and the system returns her.</w:t>
+              <w:t>Instead of using surveillance footage, police run the suspect's fake-ID photo through Clearview AI, and it returns her.</w:t>
             </w:r>
           </w:p>
         </w:tc>
@@ -1077,7 +1092,22 @@
               <w:rPr>
                 <w:sz w:val="19"/>
               </w:rPr>
-              <w:t>FIND · HORIZONTAL — network explainer on the match</w:t>
+              <w:t xml:space="preserve">HAVE · HORIZONTAL — </w:t>
+            </w:r>
+            <w:hyperlink r:id="rId9">
+              <w:r>
+                <w:rPr>
+                  <w:color w:val="1155CC"/>
+                  <w:u w:val="single"/>
+                </w:rPr>
+                <w:t xml:space="preserve">ABC News 4 / WCYB</w:t>
+              </w:r>
+            </w:hyperlink>
+            <w:r>
+              <w:rPr>
+                <w:sz w:val="19"/>
+              </w:rPr>
+              <w:t>, attorney on the match; alt: Fargo chief's March apology</w:t>
             </w:r>
           </w:p>
         </w:tc>
@@ -1111,7 +1141,7 @@
               <w:rPr>
                 <w:sz w:val="19"/>
               </w:rPr>
-              <w:t>Months inside</w:t>
+              <w:t>108 days</w:t>
             </w:r>
           </w:p>
         </w:tc>
@@ -1143,7 +1173,7 @@
               <w:rPr>
                 <w:sz w:val="19"/>
               </w:rPr>
-              <w:t>She sits in jail for months until her lawyer's bank records prove she was home; charges dropped Christmas Eve.</w:t>
+              <w:t>She sits 108 days with no bail and no interview until bank records clear her; she loses her home and car.</w:t>
             </w:r>
           </w:p>
         </w:tc>
@@ -1159,7 +1189,22 @@
               <w:rPr>
                 <w:sz w:val="19"/>
               </w:rPr>
-              <w:t>FIND · HORIZONTAL — Lipps on the jail time</w:t>
+              <w:t xml:space="preserve">HAVE · HORIZONTAL — </w:t>
+            </w:r>
+            <w:hyperlink r:id="rId10">
+              <w:r>
+                <w:rPr>
+                  <w:color w:val="1155CC"/>
+                  <w:u w:val="single"/>
+                </w:rPr>
+                <w:t xml:space="preserve">CBS News</w:t>
+              </w:r>
+            </w:hyperlink>
+            <w:r>
+              <w:rPr>
+                <w:sz w:val="19"/>
+              </w:rPr>
+              <w:t>, jail and release</w:t>
             </w:r>
           </w:p>
         </w:tc>
@@ -1193,7 +1238,7 @@
               <w:rPr>
                 <w:sz w:val="19"/>
               </w:rPr>
-              <w:t>"Errors were made"</w:t>
+              <w:t>The wrong Durango</w:t>
             </w:r>
           </w:p>
         </w:tc>
@@ -1209,7 +1254,7 @@
               <w:rPr>
                 <w:sz w:val="19"/>
               </w:rPr>
-              <w:t>Dave Zibolski, then-Fargo police chief</w:t>
+              <w:t>Lindsey Isaacs, wrongly accused driver</w:t>
             </w:r>
           </w:p>
         </w:tc>
@@ -1225,7 +1270,7 @@
               <w:rPr>
                 <w:sz w:val="19"/>
               </w:rPr>
-              <w:t>In March the chief admits errors, apologizes and issues a new facial-recognition policy.</w:t>
+              <w:t>Witnesses saw a maroon Durango at a triple-fatal crash; a plate reader caught her black one, and she's charged.</w:t>
             </w:r>
           </w:p>
         </w:tc>
@@ -1241,7 +1286,7 @@
               <w:rPr>
                 <w:sz w:val="19"/>
               </w:rPr>
-              <w:t>FIND · HORIZONTAL — March press conference</w:t>
+              <w:t>FIND · HORIZONTAL — Isaacs interview (CNN, 404 Media, Fox 35)</w:t>
             </w:r>
           </w:p>
         </w:tc>
@@ -1275,7 +1320,7 @@
               <w:rPr>
                 <w:sz w:val="19"/>
               </w:rPr>
-              <w:t>The lawsuit</w:t>
+              <w:t>86 hours</w:t>
             </w:r>
           </w:p>
         </w:tc>
@@ -1291,7 +1336,7 @@
               <w:rPr>
                 <w:sz w:val="19"/>
               </w:rPr>
-              <w:t>Eric Rice, Lipps' attorney</w:t>
+              <w:t>Lindsey Isaacs</w:t>
             </w:r>
           </w:p>
         </w:tc>
@@ -1307,7 +1352,7 @@
               <w:rPr>
                 <w:sz w:val="19"/>
               </w:rPr>
-              <w:t>She sues Fargo and the former detective for $10 million in federal court.</w:t>
+              <w:t>She tells U.S. senators her cell door wasn't opened for about 86 hours; her car had no damage.</w:t>
             </w:r>
           </w:p>
         </w:tc>
@@ -1323,7 +1368,7 @@
               <w:rPr>
                 <w:sz w:val="19"/>
               </w:rPr>
-              <w:t>FIND · HORIZONTAL — lawsuit coverage, CBS or KSTP</w:t>
+              <w:t>FIND · HORIZONTAL — Isaacs' Senate testimony (Fox 35 Orlando, USA Today)</w:t>
             </w:r>
           </w:p>
         </w:tc>
@@ -1357,7 +1402,7 @@
               <w:rPr>
                 <w:sz w:val="19"/>
               </w:rPr>
-              <w:t>Could it be you</w:t>
+              <w:t>"You know why I'm here"</w:t>
             </w:r>
           </w:p>
         </w:tc>
@@ -1373,7 +1418,7 @@
               <w:rPr>
                 <w:sz w:val="19"/>
               </w:rPr>
-              <w:t>You (the viewer)</w:t>
+              <w:t>Chrisanna Elser, Colorado driver</w:t>
             </w:r>
           </w:p>
         </w:tc>
@@ -1389,7 +1434,7 @@
               <w:rPr>
                 <w:sz w:val="19"/>
               </w:rPr>
-              <w:t>A face match is supposed to be a lead, not an ID, and many searches start from public social-media photos.</w:t>
+              <w:t>Her doorbell records a sergeant accusing her of package theft; asked for his video, he says she can see it in court.</w:t>
             </w:r>
           </w:p>
         </w:tc>
@@ -1405,7 +1450,7 @@
               <w:rPr>
                 <w:sz w:val="19"/>
               </w:rPr>
-              <w:t>JEFF</w:t>
+              <w:t>FIND · VERTICAL — Elser's doorbell exchange, via CBS Colorado or FOX31</w:t>
             </w:r>
           </w:p>
         </w:tc>
@@ -1439,7 +1484,89 @@
               <w:rPr>
                 <w:sz w:val="19"/>
               </w:rPr>
-              <w:t>Your alibi is in your pocket</w:t>
+              <w:t>Her car was her alibi</w:t>
+            </w:r>
+          </w:p>
+        </w:tc>
+        <w:tc>
+          <w:tcPr>
+            <w:tcW w:type="dxa" w:w="2160"/>
+          </w:tcPr>
+          <w:p>
+            <w:pPr>
+              <w:spacing w:after="40"/>
+            </w:pPr>
+            <w:r>
+              <w:rPr>
+                <w:sz w:val="19"/>
+              </w:rPr>
+              <w:t>Chrisanna Elser</w:t>
+            </w:r>
+          </w:p>
+        </w:tc>
+        <w:tc>
+          <w:tcPr>
+            <w:tcW w:type="dxa" w:w="4104"/>
+          </w:tcPr>
+          <w:p>
+            <w:pPr>
+              <w:spacing w:after="40"/>
+            </w:pPr>
+            <w:r>
+              <w:rPr>
+                <w:sz w:val="19"/>
+              </w:rPr>
+              <w:t>Her Rivian's cameras logged her route; weeks later the chief emails "nicely done btw" and drops the summons.</w:t>
+            </w:r>
+          </w:p>
+        </w:tc>
+        <w:tc>
+          <w:tcPr>
+            <w:tcW w:type="dxa" w:w="1584"/>
+          </w:tcPr>
+          <w:p>
+            <w:pPr>
+              <w:spacing w:after="40"/>
+            </w:pPr>
+            <w:r>
+              <w:rPr>
+                <w:sz w:val="19"/>
+              </w:rPr>
+              <w:t>FIND · HORIZONTAL — CBS Colorado interview with Elser</w:t>
+            </w:r>
+          </w:p>
+        </w:tc>
+      </w:tr>
+      <w:tr>
+        <w:tc>
+          <w:tcPr>
+            <w:tcW w:type="dxa" w:w="432"/>
+          </w:tcPr>
+          <w:p>
+            <w:pPr>
+              <w:spacing w:after="40"/>
+            </w:pPr>
+            <w:r>
+              <w:rPr>
+                <w:sz w:val="19"/>
+              </w:rPr>
+              <w:t>9</w:t>
+            </w:r>
+          </w:p>
+        </w:tc>
+        <w:tc>
+          <w:tcPr>
+            <w:tcW w:type="dxa" w:w="1656"/>
+          </w:tcPr>
+          <w:p>
+            <w:pPr>
+              <w:spacing w:after="40"/>
+            </w:pPr>
+            <w:r>
+              <w:rPr>
+                <w:sz w:val="19"/>
+              </w:rPr>
+              <w:t>Your alibi is on a timer</w:t>
             </w:r>
           </w:p>
         </w:tc>
@@ -1471,7 +1598,7 @@
               <w:rPr>
                 <w:sz w:val="19"/>
               </w:rPr>
-              <w:t>Jeff opens the location history already on his phone, the kind of record that freed her.</w:t>
+              <w:t>Police came months later; Google Maps Timeline can auto-delete after three months, so Jeff changes his, live.</w:t>
             </w:r>
           </w:p>
         </w:tc>
@@ -1503,540 +1630,6 @@
           <w:color w:val="333333"/>
           <w:sz w:val="22"/>
         </w:rPr>
-        <w:t>Videos</w:t>
-      </w:r>
-    </w:p>
-    <w:tbl>
-      <w:tblPr>
-        <w:tblStyle w:val="TableGrid"/>
-        <w:tblW w:type="auto" w:w="0"/>
-        <w:jc w:val="center"/>
-        <w:tblLayout w:type="fixed"/>
-        <w:tblLook w:firstColumn="1" w:firstRow="1" w:lastColumn="0" w:lastRow="0" w:noHBand="0" w:noVBand="1" w:val="04A0"/>
-      </w:tblPr>
-      <w:tblGrid>
-        <w:gridCol w:w="432"/>
-        <w:gridCol w:w="2664"/>
-        <w:gridCol w:w="3096"/>
-        <w:gridCol w:w="2376"/>
-        <w:gridCol w:w="1368"/>
-      </w:tblGrid>
-      <w:tr>
-        <w:tc>
-          <w:tcPr>
-            <w:tcW w:type="dxa" w:w="432"/>
-          </w:tcPr>
-          <w:p>
-            <w:r>
-              <w:rPr>
-                <w:b/>
-                <w:sz w:val="19"/>
-              </w:rPr>
-              <w:t>#</w:t>
-            </w:r>
-          </w:p>
-        </w:tc>
-        <w:tc>
-          <w:tcPr>
-            <w:tcW w:type="dxa" w:w="2664"/>
-          </w:tcPr>
-          <w:p>
-            <w:r>
-              <w:rPr>
-                <w:b/>
-                <w:sz w:val="19"/>
-              </w:rPr>
-              <w:t>Clip</w:t>
-            </w:r>
-          </w:p>
-        </w:tc>
-        <w:tc>
-          <w:tcPr>
-            <w:tcW w:type="dxa" w:w="3096"/>
-          </w:tcPr>
-          <w:p>
-            <w:r>
-              <w:rPr>
-                <w:b/>
-                <w:sz w:val="19"/>
-              </w:rPr>
-              <w:t>Shows</w:t>
-            </w:r>
-          </w:p>
-        </w:tc>
-        <w:tc>
-          <w:tcPr>
-            <w:tcW w:type="dxa" w:w="2376"/>
-          </w:tcPr>
-          <w:p>
-            <w:r>
-              <w:rPr>
-                <w:b/>
-                <w:sz w:val="19"/>
-              </w:rPr>
-              <w:t>In–Out</w:t>
-            </w:r>
-          </w:p>
-        </w:tc>
-        <w:tc>
-          <w:tcPr>
-            <w:tcW w:type="dxa" w:w="1368"/>
-          </w:tcPr>
-          <w:p>
-            <w:r>
-              <w:rPr>
-                <w:b/>
-                <w:sz w:val="19"/>
-              </w:rPr>
-              <w:t>Status</w:t>
-            </w:r>
-          </w:p>
-        </w:tc>
-      </w:tr>
-      <w:tr>
-        <w:tc>
-          <w:tcPr>
-            <w:tcW w:type="dxa" w:w="432"/>
-          </w:tcPr>
-          <w:p>
-            <w:pPr>
-              <w:spacing w:after="40"/>
-            </w:pPr>
-            <w:r>
-              <w:rPr>
-                <w:sz w:val="19"/>
-              </w:rPr>
-              <w:t>2</w:t>
-            </w:r>
-          </w:p>
-        </w:tc>
-        <w:tc>
-          <w:tcPr>
-            <w:tcW w:type="dxa" w:w="2664"/>
-          </w:tcPr>
-          <w:p>
-            <w:pPr>
-              <w:spacing w:after="40"/>
-            </w:pPr>
-            <w:hyperlink r:id="rId9">
-              <w:r>
-                <w:rPr>
-                  <w:color w:val="1155CC"/>
-                  <w:u w:val="single"/>
-                </w:rPr>
-                <w:t xml:space="preserve">ABC News 4 / WCYB — Tennessee grandma mistakenly sent to North Dakota jail due to AI error</w:t>
-              </w:r>
-            </w:hyperlink>
-          </w:p>
-        </w:tc>
-        <w:tc>
-          <w:tcPr>
-            <w:tcW w:type="dxa" w:w="3096"/>
-          </w:tcPr>
-          <w:p>
-            <w:pPr>
-              <w:spacing w:after="40"/>
-            </w:pPr>
-            <w:r>
-              <w:rPr>
-                <w:sz w:val="19"/>
-              </w:rPr>
-              <w:t>Local package: US Marshals at her Carter County house, 50-year-old grandmother of five, a state she'd never visited. Reporter voiceover.</w:t>
-            </w:r>
-          </w:p>
-        </w:tc>
-        <w:tc>
-          <w:tcPr>
-            <w:tcW w:type="dxa" w:w="2376"/>
-          </w:tcPr>
-          <w:p>
-            <w:pPr>
-              <w:spacing w:after="40"/>
-            </w:pPr>
-            <w:r>
-              <w:rPr>
-                <w:sz w:val="19"/>
-              </w:rPr>
-              <w:t>0:16–0:31 "a state she'd never even visited"</w:t>
-            </w:r>
-          </w:p>
-        </w:tc>
-        <w:tc>
-          <w:tcPr>
-            <w:tcW w:type="dxa" w:w="1368"/>
-          </w:tcPr>
-          <w:p>
-            <w:pPr>
-              <w:spacing w:after="40"/>
-            </w:pPr>
-            <w:r>
-              <w:rPr>
-                <w:sz w:val="19"/>
-              </w:rPr>
-              <w:t>WEAK</w:t>
-            </w:r>
-          </w:p>
-        </w:tc>
-      </w:tr>
-      <w:tr>
-        <w:tc>
-          <w:tcPr>
-            <w:tcW w:type="dxa" w:w="432"/>
-          </w:tcPr>
-          <w:p>
-            <w:pPr>
-              <w:spacing w:after="40"/>
-            </w:pPr>
-            <w:r>
-              <w:rPr>
-                <w:sz w:val="19"/>
-              </w:rPr>
-              <w:t>3</w:t>
-            </w:r>
-          </w:p>
-        </w:tc>
-        <w:tc>
-          <w:tcPr>
-            <w:tcW w:type="dxa" w:w="2664"/>
-          </w:tcPr>
-          <w:p>
-            <w:pPr>
-              <w:spacing w:after="40"/>
-            </w:pPr>
-            <w:hyperlink r:id="rId9">
-              <w:r>
-                <w:rPr>
-                  <w:color w:val="1155CC"/>
-                  <w:u w:val="single"/>
-                </w:rPr>
-                <w:t xml:space="preserve">ABC News 4 / WCYB — same package</w:t>
-              </w:r>
-            </w:hyperlink>
-          </w:p>
-        </w:tc>
-        <w:tc>
-          <w:tcPr>
-            <w:tcW w:type="dxa" w:w="3096"/>
-          </w:tcPr>
-          <w:p>
-            <w:pPr>
-              <w:spacing w:after="40"/>
-            </w:pPr>
-            <w:r>
-              <w:rPr>
-                <w:sz w:val="19"/>
-              </w:rPr>
-              <w:t>Attorney Eric Rice: an AI program selected her face and an officer reviewed her social media; then the fake military ID bank fraud.</w:t>
-            </w:r>
-          </w:p>
-        </w:tc>
-        <w:tc>
-          <w:tcPr>
-            <w:tcW w:type="dxa" w:w="2376"/>
-          </w:tcPr>
-          <w:p>
-            <w:pPr>
-              <w:spacing w:after="40"/>
-            </w:pPr>
-            <w:r>
-              <w:rPr>
-                <w:sz w:val="19"/>
-              </w:rPr>
-              <w:t>0:31–0:46 "an arrest warrant to be issued for her" BUTT 0:46–1:00 "between April and May of 2025"</w:t>
-            </w:r>
-          </w:p>
-        </w:tc>
-        <w:tc>
-          <w:tcPr>
-            <w:tcW w:type="dxa" w:w="1368"/>
-          </w:tcPr>
-          <w:p>
-            <w:pPr>
-              <w:spacing w:after="40"/>
-            </w:pPr>
-            <w:r>
-              <w:rPr>
-                <w:sz w:val="19"/>
-              </w:rPr>
-              <w:t>PICK</w:t>
-            </w:r>
-          </w:p>
-        </w:tc>
-      </w:tr>
-      <w:tr>
-        <w:tc>
-          <w:tcPr>
-            <w:tcW w:type="dxa" w:w="432"/>
-          </w:tcPr>
-          <w:p>
-            <w:pPr>
-              <w:spacing w:after="40"/>
-            </w:pPr>
-            <w:r>
-              <w:rPr>
-                <w:sz w:val="19"/>
-              </w:rPr>
-              <w:t>4</w:t>
-            </w:r>
-          </w:p>
-        </w:tc>
-        <w:tc>
-          <w:tcPr>
-            <w:tcW w:type="dxa" w:w="2664"/>
-          </w:tcPr>
-          <w:p>
-            <w:pPr>
-              <w:spacing w:after="40"/>
-            </w:pPr>
-            <w:hyperlink r:id="rId10">
-              <w:r>
-                <w:rPr>
-                  <w:color w:val="1155CC"/>
-                  <w:u w:val="single"/>
-                </w:rPr>
-                <w:t xml:space="preserve">CBS News — Grandmother falsely accused of bank fraud sues Fargo</w:t>
-              </w:r>
-            </w:hyperlink>
-          </w:p>
-        </w:tc>
-        <w:tc>
-          <w:tcPr>
-            <w:tcW w:type="dxa" w:w="3096"/>
-          </w:tcPr>
-          <w:p>
-            <w:pPr>
-              <w:spacing w:after="40"/>
-            </w:pPr>
-            <w:r>
-              <w:rPr>
-                <w:sz w:val="19"/>
-              </w:rPr>
-              <w:t>Correspondent: months behind bars, couldn't make bail, bank records freed her, released Christmas Eve in the clothes she was booked in.</w:t>
-            </w:r>
-          </w:p>
-        </w:tc>
-        <w:tc>
-          <w:tcPr>
-            <w:tcW w:type="dxa" w:w="2376"/>
-          </w:tcPr>
-          <w:p>
-            <w:pPr>
-              <w:spacing w:after="40"/>
-            </w:pPr>
-            <w:r>
-              <w:rPr>
-                <w:sz w:val="19"/>
-              </w:rPr>
-              <w:t>1:16–1:46 "the same clothes she was booked in in July"</w:t>
-            </w:r>
-          </w:p>
-        </w:tc>
-        <w:tc>
-          <w:tcPr>
-            <w:tcW w:type="dxa" w:w="1368"/>
-          </w:tcPr>
-          <w:p>
-            <w:pPr>
-              <w:spacing w:after="40"/>
-            </w:pPr>
-            <w:r>
-              <w:rPr>
-                <w:sz w:val="19"/>
-              </w:rPr>
-              <w:t>PICK</w:t>
-            </w:r>
-          </w:p>
-        </w:tc>
-      </w:tr>
-      <w:tr>
-        <w:tc>
-          <w:tcPr>
-            <w:tcW w:type="dxa" w:w="432"/>
-          </w:tcPr>
-          <w:p>
-            <w:pPr>
-              <w:spacing w:after="40"/>
-            </w:pPr>
-            <w:r>
-              <w:rPr>
-                <w:sz w:val="19"/>
-              </w:rPr>
-              <w:t>5</w:t>
-            </w:r>
-          </w:p>
-        </w:tc>
-        <w:tc>
-          <w:tcPr>
-            <w:tcW w:type="dxa" w:w="2664"/>
-          </w:tcPr>
-          <w:p>
-            <w:pPr>
-              <w:spacing w:after="40"/>
-            </w:pPr>
-            <w:hyperlink r:id="rId11">
-              <w:r>
-                <w:rPr>
-                  <w:color w:val="1155CC"/>
-                  <w:u w:val="single"/>
-                </w:rPr>
-                <w:t xml:space="preserve">KVRR — Fargo Police Chief admits mistakes were made in Lipps case</w:t>
-              </w:r>
-            </w:hyperlink>
-          </w:p>
-        </w:tc>
-        <w:tc>
-          <w:tcPr>
-            <w:tcW w:type="dxa" w:w="3096"/>
-          </w:tcPr>
-          <w:p>
-            <w:pPr>
-              <w:spacing w:after="40"/>
-            </w:pPr>
-            <w:r>
-              <w:rPr>
-                <w:sz w:val="19"/>
-              </w:rPr>
-              <w:t>By title, the chief's admission; transcript not reached (bot wall, two attempts).</w:t>
-            </w:r>
-          </w:p>
-        </w:tc>
-        <w:tc>
-          <w:tcPr>
-            <w:tcW w:type="dxa" w:w="2376"/>
-          </w:tcPr>
-          <w:p>
-            <w:pPr>
-              <w:spacing w:after="40"/>
-            </w:pPr>
-            <w:r>
-              <w:rPr>
-                <w:sz w:val="19"/>
-              </w:rPr>
-              <w:t>—</w:t>
-            </w:r>
-          </w:p>
-        </w:tc>
-        <w:tc>
-          <w:tcPr>
-            <w:tcW w:type="dxa" w:w="1368"/>
-          </w:tcPr>
-          <w:p>
-            <w:pPr>
-              <w:spacing w:after="40"/>
-            </w:pPr>
-            <w:r>
-              <w:rPr>
-                <w:sz w:val="19"/>
-              </w:rPr>
-              <w:t>THROTTLED</w:t>
-            </w:r>
-          </w:p>
-        </w:tc>
-      </w:tr>
-      <w:tr>
-        <w:tc>
-          <w:tcPr>
-            <w:tcW w:type="dxa" w:w="432"/>
-          </w:tcPr>
-          <w:p>
-            <w:pPr>
-              <w:spacing w:after="40"/>
-            </w:pPr>
-            <w:r>
-              <w:rPr>
-                <w:sz w:val="19"/>
-              </w:rPr>
-              <w:t>6</w:t>
-            </w:r>
-          </w:p>
-        </w:tc>
-        <w:tc>
-          <w:tcPr>
-            <w:tcW w:type="dxa" w:w="2664"/>
-          </w:tcPr>
-          <w:p>
-            <w:pPr>
-              <w:spacing w:after="40"/>
-            </w:pPr>
-            <w:hyperlink r:id="rId10">
-              <w:r>
-                <w:rPr>
-                  <w:color w:val="1155CC"/>
-                  <w:u w:val="single"/>
-                </w:rPr>
-                <w:t xml:space="preserve">CBS News — same package</w:t>
-              </w:r>
-            </w:hyperlink>
-          </w:p>
-        </w:tc>
-        <w:tc>
-          <w:tcPr>
-            <w:tcW w:type="dxa" w:w="3096"/>
-          </w:tcPr>
-          <w:p>
-            <w:pPr>
-              <w:spacing w:after="40"/>
-            </w:pPr>
-            <w:r>
-              <w:rPr>
-                <w:sz w:val="19"/>
-              </w:rPr>
-              <w:t>Anchor intro: never set foot in North Dakota, suing Fargo; then the civil-rights and malicious-prosecution claims.</w:t>
-            </w:r>
-          </w:p>
-        </w:tc>
-        <w:tc>
-          <w:tcPr>
-            <w:tcW w:type="dxa" w:w="2376"/>
-          </w:tcPr>
-          <w:p>
-            <w:pPr>
-              <w:spacing w:after="40"/>
-            </w:pPr>
-            <w:r>
-              <w:rPr>
-                <w:sz w:val="19"/>
-              </w:rPr>
-              <w:t>0:00–0:19 "for false arrest" BUTT 0:42–0:57 "what she believes was malicious prosecution"</w:t>
-            </w:r>
-          </w:p>
-        </w:tc>
-        <w:tc>
-          <w:tcPr>
-            <w:tcW w:type="dxa" w:w="1368"/>
-          </w:tcPr>
-          <w:p>
-            <w:pPr>
-              <w:spacing w:after="40"/>
-            </w:pPr>
-            <w:r>
-              <w:rPr>
-                <w:sz w:val="19"/>
-              </w:rPr>
-              <w:t>PICK</w:t>
-            </w:r>
-          </w:p>
-        </w:tc>
-      </w:tr>
-    </w:tbl>
-    <w:p/>
-    <w:p>
-      <w:r>
-        <w:rPr>
-          <w:i/>
-        </w:rPr>
-        <w:t>Row 2: no Lipps soundbite in any transcript reached. Rows 4 and 6: CBS says "Lipscomb" at 0:32 and 1:08, outside both segments.</w:t>
-      </w:r>
-    </w:p>
-    <w:p>
-      <w:pPr>
-        <w:pStyle w:val="Heading3"/>
-      </w:pPr>
-      <w:r>
-        <w:rPr>
-          <w:color w:val="333333"/>
-          <w:sz w:val="22"/>
-        </w:rPr>
         <w:t>The fix</w:t>
       </w:r>
     </w:p>
@@ -2049,16 +1642,10 @@
         <w:rPr>
           <w:b/>
         </w:rPr>
-        <w:t>Your alibi is already on your phone.</w:t>
+        <w:t>Your alibi is on a timer.</w:t>
       </w:r>
       <w:r>
-        <w:t xml:space="preserve"> iPhone: Settings → Privacy &amp; Security → Location Services → System Services → Significant Locations &amp; Routes. Android: Google Maps → your profile picture → Your Timeline. Keep it on, or know it's there. </w:t>
-      </w:r>
-      <w:r>
-        <w:rPr>
-          <w:i/>
-        </w:rPr>
-        <w:t>(verify on current iOS/Android)</w:t>
+        <w:t xml:space="preserve"> Records cleared all three: Lipps with bank statements, Elser with her car's cameras. And police came months later: about two months for Lipps, about six for Isaacs.</w:t>
       </w:r>
     </w:p>
     <w:p>
@@ -2067,7 +1654,19 @@
         <w:spacing w:after="40"/>
       </w:pPr>
       <w:r>
-        <w:t>Your bank and card statements are the other half of an alibi. Know how to download them fast.</w:t>
+        <w:rPr>
+          <w:b/>
+        </w:rPr>
+        <w:t>Change auto-delete:</w:t>
+      </w:r>
+      <w:r>
+        <w:t xml:space="preserve"> Google Maps → Your Timeline → ⋯ → Location &amp; privacy settings → Auto-delete Timeline → 36 months, or off. </w:t>
+      </w:r>
+      <w:r>
+        <w:rPr>
+          <w:i/>
+        </w:rPr>
+        <w:t>(verify on Jeff's phone)</w:t>
       </w:r>
     </w:p>
     <w:p>
@@ -2076,7 +1675,19 @@
         <w:spacing w:after="40"/>
       </w:pPr>
       <w:r>
-        <w:t>If you're ever charged: say nothing without a lawyer, and have the lawyer demand the facial-recognition report and whether a human confirmed the match.</w:t>
+        <w:rPr>
+          <w:b/>
+        </w:rPr>
+        <w:t>Turn on backup:</w:t>
+      </w:r>
+      <w:r>
+        <w:t xml:space="preserve"> auto-delete must be off first. With backup on, your Timeline survives a lost or broken phone. Works on iPhone too, in the Google Maps app. </w:t>
+      </w:r>
+      <w:r>
+        <w:rPr>
+          <w:i/>
+        </w:rPr>
+        <w:t>(verify)</w:t>
       </w:r>
     </w:p>
     <w:p>
@@ -2085,13 +1696,22 @@
         <w:spacing w:after="40"/>
       </w:pPr>
       <w:r>
-        <w:t xml:space="preserve">Want your face out of public face-search sites? PimEyes has a free opt-out form (pimeyes.com/en/opt-out). It doesn't touch police databases. </w:t>
+        <w:rPr>
+          <w:b/>
+        </w:rPr>
+        <w:t>Know your other records:</w:t>
       </w:r>
       <w:r>
-        <w:rPr>
-          <w:i/>
-        </w:rPr>
-        <w:t>(verify)</w:t>
+        <w:t xml:space="preserve"> how long your doorbell and dashcam keep footage, and that bank statements show where you were.</w:t>
+      </w:r>
+    </w:p>
+    <w:p>
+      <w:pPr>
+        <w:pStyle w:val="ListBullet"/>
+        <w:spacing w:after="40"/>
+      </w:pPr>
+      <w:r>
+        <w:t>Say it plainly: that history can clear you, and it can also be subpoenaed. Your call.</w:t>
       </w:r>
     </w:p>
     <w:p>
@@ -2112,7 +1732,7 @@
         <w:spacing w:after="40"/>
       </w:pPr>
       <w:r>
-        <w:t>⚠️ Beat 2: "arrested at gunpoint" is her attorney's framing. Attribute it to him, don't state it.</w:t>
+        <w:t>⚠️ Beat 1: the 16 (Policing Project, to Fox) counts face-recognition cases only. Isaacs and Elser are not in it.</w:t>
       </w:r>
     </w:p>
     <w:p>
@@ -2121,7 +1741,7 @@
         <w:spacing w:after="40"/>
       </w:pPr>
       <w:r>
-        <w:t>⚠️ Beat 4: jail time varies by outlet (about six months per ABC and MPR, three per WCTI). Say "months" until the complaint is pulled.</w:t>
+        <w:t>⚠️ Beat 2: "at gunpoint" is her side's account. Attribute it.</w:t>
       </w:r>
     </w:p>
     <w:p>
@@ -2130,7 +1750,7 @@
         <w:spacing w:after="40"/>
       </w:pPr>
       <w:r>
-        <w:t>⚠️ Beat 4: "lost her home and car" is from ABC's summary of the suit. Pull the complaint.</w:t>
+        <w:t>⚠️ Beats 3–4: Clearview AI, 108 days and "no one interviewed her" are new figures; the 9/29 outline had "months" and an unnamed AI tool. Pull the complaint. Suit date: Sept 15 here, Sept 16 per MPR.</w:t>
       </w:r>
     </w:p>
     <w:p>
@@ -2139,7 +1759,25 @@
         <w:spacing w:after="40"/>
       </w:pPr>
       <w:r>
-        <w:t>⚠️ Beat 7: that the search began from her social-media photo is one ABC line. Confirm in the complaint before the fix leans on it.</w:t>
+        <w:t>⚠️ Beats 5–6: which Senate committee held the hearing. Outlets say 13 days in jail; the brief says about 10 in maximum security. Isaacs' state (I-4, Fox 35 Orlando: likely Florida).</w:t>
+      </w:r>
+    </w:p>
+    <w:p>
+      <w:pPr>
+        <w:pStyle w:val="ListBullet"/>
+        <w:spacing w:after="40"/>
+      </w:pPr>
+      <w:r>
+        <w:t>⚠️ Beats 7–8: Elser's accusation came from a Flock hit (per 9NEWS, FOX31 titles). "Nicely done btw" and the discipline (9NEWS) need the source loaded.</w:t>
+      </w:r>
+    </w:p>
+    <w:p>
+      <w:pPr>
+        <w:pStyle w:val="ListBullet"/>
+        <w:spacing w:after="40"/>
+      </w:pPr>
+      <w:r>
+        <w:t>⚠️ Beat 9: Google's default auto-delete isn't on its help page. One tester who turned Timeline on Sept 14, 2026 found it set to 3 months. At that setting, Isaacs' proof would have been gone before troopers knocked; say "could have been."</w:t>
       </w:r>
     </w:p>
     <w:p>
@@ -2356,7 +1994,22 @@
               <w:rPr>
                 <w:sz w:val="19"/>
               </w:rPr>
-              <w:t>FIND · VERTICAL BROLL — Caper Cart in an aisle</w:t>
+              <w:t xml:space="preserve">HAVE · VERTICAL BROLL — </w:t>
+            </w:r>
+            <w:hyperlink r:id="rId11">
+              <w:r>
+                <w:rPr>
+                  <w:color w:val="1155CC"/>
+                  <w:u w:val="single"/>
+                </w:rPr>
+                <w:t xml:space="preserve">Instacart, Meet Caper Cart</w:t>
+              </w:r>
+            </w:hyperlink>
+            <w:r>
+              <w:rPr>
+                <w:sz w:val="19"/>
+              </w:rPr>
+              <w:t xml:space="preserve"> (CROP)</w:t>
             </w:r>
           </w:p>
         </w:tc>
@@ -2438,8 +2091,17 @@
               <w:rPr>
                 <w:sz w:val="19"/>
               </w:rPr>
-              <w:t>HAVE · VERTICAL — TikTok @user60342208753</w:t>
+              <w:t xml:space="preserve">HAVE · VERTICAL — </w:t>
             </w:r>
+            <w:hyperlink r:id="rId12">
+              <w:r>
+                <w:rPr>
+                  <w:color w:val="1155CC"/>
+                  <w:u w:val="single"/>
+                </w:rPr>
+                <w:t xml:space="preserve">TikTok @user60342208753</w:t>
+              </w:r>
+            </w:hyperlink>
           </w:p>
         </w:tc>
       </w:tr>
@@ -2520,8 +2182,17 @@
               <w:rPr>
                 <w:sz w:val="19"/>
               </w:rPr>
-              <w:t>FIND · HORIZONTAL — plate cameras at a home store</w:t>
+              <w:t xml:space="preserve">HAVE · HORIZONTAL — </w:t>
             </w:r>
+            <w:hyperlink r:id="rId13">
+              <w:r>
+                <w:rPr>
+                  <w:color w:val="1155CC"/>
+                  <w:u w:val="single"/>
+                </w:rPr>
+                <w:t xml:space="preserve">NBC Connecticut, plate readers at Lowe's</w:t>
+              </w:r>
+            </w:hyperlink>
           </w:p>
         </w:tc>
       </w:tr>
@@ -2618,370 +2289,6 @@
           <w:color w:val="333333"/>
           <w:sz w:val="22"/>
         </w:rPr>
-        <w:t>Videos</w:t>
-      </w:r>
-    </w:p>
-    <w:tbl>
-      <w:tblPr>
-        <w:tblStyle w:val="TableGrid"/>
-        <w:tblW w:type="auto" w:w="0"/>
-        <w:jc w:val="center"/>
-        <w:tblLayout w:type="fixed"/>
-        <w:tblLook w:firstColumn="1" w:firstRow="1" w:lastColumn="0" w:lastRow="0" w:noHBand="0" w:noVBand="1" w:val="04A0"/>
-      </w:tblPr>
-      <w:tblGrid>
-        <w:gridCol w:w="432"/>
-        <w:gridCol w:w="2664"/>
-        <w:gridCol w:w="3096"/>
-        <w:gridCol w:w="2376"/>
-        <w:gridCol w:w="1368"/>
-      </w:tblGrid>
-      <w:tr>
-        <w:tc>
-          <w:tcPr>
-            <w:tcW w:type="dxa" w:w="432"/>
-          </w:tcPr>
-          <w:p>
-            <w:r>
-              <w:rPr>
-                <w:b/>
-                <w:sz w:val="19"/>
-              </w:rPr>
-              <w:t>#</w:t>
-            </w:r>
-          </w:p>
-        </w:tc>
-        <w:tc>
-          <w:tcPr>
-            <w:tcW w:type="dxa" w:w="2664"/>
-          </w:tcPr>
-          <w:p>
-            <w:r>
-              <w:rPr>
-                <w:b/>
-                <w:sz w:val="19"/>
-              </w:rPr>
-              <w:t>Clip</w:t>
-            </w:r>
-          </w:p>
-        </w:tc>
-        <w:tc>
-          <w:tcPr>
-            <w:tcW w:type="dxa" w:w="3096"/>
-          </w:tcPr>
-          <w:p>
-            <w:r>
-              <w:rPr>
-                <w:b/>
-                <w:sz w:val="19"/>
-              </w:rPr>
-              <w:t>Shows</w:t>
-            </w:r>
-          </w:p>
-        </w:tc>
-        <w:tc>
-          <w:tcPr>
-            <w:tcW w:type="dxa" w:w="2376"/>
-          </w:tcPr>
-          <w:p>
-            <w:r>
-              <w:rPr>
-                <w:b/>
-                <w:sz w:val="19"/>
-              </w:rPr>
-              <w:t>In–Out</w:t>
-            </w:r>
-          </w:p>
-        </w:tc>
-        <w:tc>
-          <w:tcPr>
-            <w:tcW w:type="dxa" w:w="1368"/>
-          </w:tcPr>
-          <w:p>
-            <w:r>
-              <w:rPr>
-                <w:b/>
-                <w:sz w:val="19"/>
-              </w:rPr>
-              <w:t>Status</w:t>
-            </w:r>
-          </w:p>
-        </w:tc>
-      </w:tr>
-      <w:tr>
-        <w:tc>
-          <w:tcPr>
-            <w:tcW w:type="dxa" w:w="432"/>
-          </w:tcPr>
-          <w:p>
-            <w:pPr>
-              <w:spacing w:after="40"/>
-            </w:pPr>
-            <w:r>
-              <w:rPr>
-                <w:sz w:val="19"/>
-              </w:rPr>
-              <w:t>1</w:t>
-            </w:r>
-          </w:p>
-        </w:tc>
-        <w:tc>
-          <w:tcPr>
-            <w:tcW w:type="dxa" w:w="2664"/>
-          </w:tcPr>
-          <w:p>
-            <w:pPr>
-              <w:spacing w:after="40"/>
-            </w:pPr>
-            <w:hyperlink r:id="rId12">
-              <w:r>
-                <w:rPr>
-                  <w:color w:val="1155CC"/>
-                  <w:u w:val="single"/>
-                </w:rPr>
-                <w:t xml:space="preserve">Instacart — Meet Caper Cart</w:t>
-              </w:r>
-            </w:hyperlink>
-          </w:p>
-        </w:tc>
-        <w:tc>
-          <w:tcPr>
-            <w:tcW w:type="dxa" w:w="3096"/>
-          </w:tcPr>
-          <w:p>
-            <w:pPr>
-              <w:spacing w:after="40"/>
-            </w:pPr>
-            <w:r>
-              <w:rPr>
-                <w:sz w:val="19"/>
-              </w:rPr>
-              <w:t>The cart in an aisle, items dropped in, computer-vision cameras, then location-based deals and personalized ads.</w:t>
-            </w:r>
-          </w:p>
-        </w:tc>
-        <w:tc>
-          <w:tcPr>
-            <w:tcW w:type="dxa" w:w="2376"/>
-          </w:tcPr>
-          <w:p>
-            <w:pPr>
-              <w:spacing w:after="40"/>
-            </w:pPr>
-            <w:r>
-              <w:rPr>
-                <w:sz w:val="19"/>
-              </w:rPr>
-              <w:t>0:00–0:43 "them and even add them back" BUTT 0:48–1:08 "your customer's"</w:t>
-            </w:r>
-          </w:p>
-        </w:tc>
-        <w:tc>
-          <w:tcPr>
-            <w:tcW w:type="dxa" w:w="1368"/>
-          </w:tcPr>
-          <w:p>
-            <w:pPr>
-              <w:spacing w:after="40"/>
-            </w:pPr>
-            <w:r>
-              <w:rPr>
-                <w:sz w:val="19"/>
-              </w:rPr>
-              <w:t>PICK · CROP</w:t>
-            </w:r>
-          </w:p>
-        </w:tc>
-      </w:tr>
-      <w:tr>
-        <w:tc>
-          <w:tcPr>
-            <w:tcW w:type="dxa" w:w="432"/>
-          </w:tcPr>
-          <w:p>
-            <w:pPr>
-              <w:spacing w:after="40"/>
-            </w:pPr>
-            <w:r>
-              <w:rPr>
-                <w:sz w:val="19"/>
-              </w:rPr>
-              <w:t>2</w:t>
-            </w:r>
-          </w:p>
-        </w:tc>
-        <w:tc>
-          <w:tcPr>
-            <w:tcW w:type="dxa" w:w="2664"/>
-          </w:tcPr>
-          <w:p>
-            <w:pPr>
-              <w:spacing w:after="40"/>
-            </w:pPr>
-            <w:hyperlink r:id="rId13">
-              <w:r>
-                <w:rPr>
-                  <w:color w:val="1155CC"/>
-                  <w:u w:val="single"/>
-                </w:rPr>
-                <w:t xml:space="preserve">@user60342208753 — Target basket tracker</w:t>
-              </w:r>
-            </w:hyperlink>
-          </w:p>
-        </w:tc>
-        <w:tc>
-          <w:tcPr>
-            <w:tcW w:type="dxa" w:w="3096"/>
-          </w:tcPr>
-          <w:p>
-            <w:pPr>
-              <w:spacing w:after="40"/>
-            </w:pPr>
-            <w:r>
-              <w:rPr>
-                <w:sz w:val="19"/>
-              </w:rPr>
-              <w:t>Store worker calls the box on a basket a tracker, per caption and press write-up. Posted Aug 29.</w:t>
-            </w:r>
-          </w:p>
-        </w:tc>
-        <w:tc>
-          <w:tcPr>
-            <w:tcW w:type="dxa" w:w="2376"/>
-          </w:tcPr>
-          <w:p>
-            <w:pPr>
-              <w:spacing w:after="40"/>
-            </w:pPr>
-            <w:r>
-              <w:rPr>
-                <w:sz w:val="19"/>
-              </w:rPr>
-              <w:t>—</w:t>
-            </w:r>
-          </w:p>
-        </w:tc>
-        <w:tc>
-          <w:tcPr>
-            <w:tcW w:type="dxa" w:w="1368"/>
-          </w:tcPr>
-          <w:p>
-            <w:pPr>
-              <w:spacing w:after="40"/>
-            </w:pPr>
-            <w:r>
-              <w:rPr>
-                <w:sz w:val="19"/>
-              </w:rPr>
-              <w:t>MANUAL · UNVERIFIED</w:t>
-            </w:r>
-          </w:p>
-        </w:tc>
-      </w:tr>
-      <w:tr>
-        <w:tc>
-          <w:tcPr>
-            <w:tcW w:type="dxa" w:w="432"/>
-          </w:tcPr>
-          <w:p>
-            <w:pPr>
-              <w:spacing w:after="40"/>
-            </w:pPr>
-            <w:r>
-              <w:rPr>
-                <w:sz w:val="19"/>
-              </w:rPr>
-              <w:t>3</w:t>
-            </w:r>
-          </w:p>
-        </w:tc>
-        <w:tc>
-          <w:tcPr>
-            <w:tcW w:type="dxa" w:w="2664"/>
-          </w:tcPr>
-          <w:p>
-            <w:pPr>
-              <w:spacing w:after="40"/>
-            </w:pPr>
-            <w:hyperlink r:id="rId14">
-              <w:r>
-                <w:rPr>
-                  <w:color w:val="1155CC"/>
-                  <w:u w:val="single"/>
-                </w:rPr>
-                <w:t xml:space="preserve">NBC Connecticut — License plate readers now at Home Depot, Lowe's</w:t>
-              </w:r>
-            </w:hyperlink>
-          </w:p>
-        </w:tc>
-        <w:tc>
-          <w:tcPr>
-            <w:tcW w:type="dxa" w:w="3096"/>
-          </w:tcPr>
-          <w:p>
-            <w:pPr>
-              <w:spacing w:after="40"/>
-            </w:pPr>
-            <w:r>
-              <w:rPr>
-                <w:sz w:val="19"/>
-              </w:rPr>
-              <w:t>Plate cameras at a Lowe's entrance in Newington, CT, then a professor on oversight and data retention.</w:t>
-            </w:r>
-          </w:p>
-        </w:tc>
-        <w:tc>
-          <w:tcPr>
-            <w:tcW w:type="dxa" w:w="2376"/>
-          </w:tcPr>
-          <w:p>
-            <w:pPr>
-              <w:spacing w:after="40"/>
-            </w:pPr>
-            <w:r>
-              <w:rPr>
-                <w:sz w:val="19"/>
-              </w:rPr>
-              <w:t>0:17–0:51 "now using them to prevent theft. It's an" BUTT 1:22–1:37 "accountability, data retention."</w:t>
-            </w:r>
-          </w:p>
-        </w:tc>
-        <w:tc>
-          <w:tcPr>
-            <w:tcW w:type="dxa" w:w="1368"/>
-          </w:tcPr>
-          <w:p>
-            <w:pPr>
-              <w:spacing w:after="40"/>
-            </w:pPr>
-            <w:r>
-              <w:rPr>
-                <w:sz w:val="19"/>
-              </w:rPr>
-              <w:t>PICK</w:t>
-            </w:r>
-          </w:p>
-        </w:tc>
-      </w:tr>
-    </w:tbl>
-    <w:p/>
-    <w:p>
-      <w:r>
-        <w:rPr>
-          <w:i/>
-        </w:rPr>
-        <w:t>Rows 1 and 3 reused from run LIVE_10072026 and re-verified against captions this run. Row 2: no caption track, and media downloads blocked, so no Whisper.</w:t>
-      </w:r>
-    </w:p>
-    <w:p>
-      <w:pPr>
-        <w:pStyle w:val="Heading3"/>
-      </w:pPr>
-      <w:r>
-        <w:rPr>
-          <w:color w:val="333333"/>
-          <w:sz w:val="22"/>
-        </w:rPr>
         <w:t>The fix</w:t>
       </w:r>
     </w:p>
@@ -3063,7 +2370,7 @@
         <w:spacing w:after="40"/>
       </w:pPr>
       <w:r>
-        <w:t>Jeff's Jan 22 "These Stores Are Spying On You" covered store tracking. New here: the AI carts and the basket beacon.</w:t>
+        <w:t>Jeff's Jan 22 show covered store tracking. New here: the AI carts and the beacon.</w:t>
       </w:r>
     </w:p>
     <w:p>
@@ -3280,7 +2587,37 @@
               <w:rPr>
                 <w:sz w:val="19"/>
               </w:rPr>
-              <w:t>FIND · VERTICAL — viral AI drive-thru fail</w:t>
+              <w:t xml:space="preserve">HAVE · VERTICAL — </w:t>
+            </w:r>
+            <w:hyperlink r:id="rId14">
+              <w:r>
+                <w:rPr>
+                  <w:color w:val="1155CC"/>
+                  <w:u w:val="single"/>
+                </w:rPr>
+                <w:t xml:space="preserve">@typical_redhead_</w:t>
+              </w:r>
+            </w:hyperlink>
+            <w:r>
+              <w:rPr>
+                <w:sz w:val="19"/>
+              </w:rPr>
+              <w:t xml:space="preserve"> or </w:t>
+            </w:r>
+            <w:hyperlink r:id="rId15">
+              <w:r>
+                <w:rPr>
+                  <w:color w:val="1155CC"/>
+                  <w:u w:val="single"/>
+                </w:rPr>
+                <w:t xml:space="preserve">@kristinealise</w:t>
+              </w:r>
+            </w:hyperlink>
+            <w:r>
+              <w:rPr>
+                <w:sz w:val="19"/>
+              </w:rPr>
+              <w:t>, call later</w:t>
             </w:r>
           </w:p>
         </w:tc>
@@ -3362,7 +2699,22 @@
               <w:rPr>
                 <w:sz w:val="19"/>
               </w:rPr>
-              <w:t>FIND · HORIZONTAL — news on the Burger King drive-offs</w:t>
+              <w:t xml:space="preserve">HAVE · HORIZONTAL — </w:t>
+            </w:r>
+            <w:hyperlink r:id="rId16">
+              <w:r>
+                <w:rPr>
+                  <w:color w:val="1155CC"/>
+                  <w:u w:val="single"/>
+                </w:rPr>
+                <w:t xml:space="preserve">NBC News, Burger King AI</w:t>
+              </w:r>
+            </w:hyperlink>
+            <w:r>
+              <w:rPr>
+                <w:sz w:val="19"/>
+              </w:rPr>
+              <w:t>, found 9/29 (WEAK)</w:t>
             </w:r>
           </w:p>
         </w:tc>
@@ -3444,7 +2796,22 @@
               <w:rPr>
                 <w:sz w:val="19"/>
               </w:rPr>
-              <w:t>FIND · HORIZONTAL — McDonald's retraining news</w:t>
+              <w:t xml:space="preserve">HAVE · HORIZONTAL — </w:t>
+            </w:r>
+            <w:hyperlink r:id="rId17">
+              <w:r>
+                <w:rPr>
+                  <w:color w:val="1155CC"/>
+                  <w:u w:val="single"/>
+                </w:rPr>
+                <w:t xml:space="preserve">Ecomix Simple, McDonald's retraining</w:t>
+              </w:r>
+            </w:hyperlink>
+            <w:r>
+              <w:rPr>
+                <w:sz w:val="19"/>
+              </w:rPr>
+              <w:t>, found 9/29 (WEAK)</w:t>
             </w:r>
           </w:p>
         </w:tc>
@@ -3533,385 +2900,6 @@
       </w:tr>
     </w:tbl>
     <w:p/>
-    <w:p>
-      <w:pPr>
-        <w:pStyle w:val="Heading3"/>
-      </w:pPr>
-      <w:r>
-        <w:rPr>
-          <w:color w:val="333333"/>
-          <w:sz w:val="22"/>
-        </w:rPr>
-        <w:t>Videos</w:t>
-      </w:r>
-    </w:p>
-    <w:tbl>
-      <w:tblPr>
-        <w:tblStyle w:val="TableGrid"/>
-        <w:tblW w:type="auto" w:w="0"/>
-        <w:jc w:val="center"/>
-        <w:tblLayout w:type="fixed"/>
-        <w:tblLook w:firstColumn="1" w:firstRow="1" w:lastColumn="0" w:lastRow="0" w:noHBand="0" w:noVBand="1" w:val="04A0"/>
-      </w:tblPr>
-      <w:tblGrid>
-        <w:gridCol w:w="432"/>
-        <w:gridCol w:w="2664"/>
-        <w:gridCol w:w="3096"/>
-        <w:gridCol w:w="2376"/>
-        <w:gridCol w:w="1368"/>
-      </w:tblGrid>
-      <w:tr>
-        <w:tc>
-          <w:tcPr>
-            <w:tcW w:type="dxa" w:w="432"/>
-          </w:tcPr>
-          <w:p>
-            <w:r>
-              <w:rPr>
-                <w:b/>
-                <w:sz w:val="19"/>
-              </w:rPr>
-              <w:t>#</w:t>
-            </w:r>
-          </w:p>
-        </w:tc>
-        <w:tc>
-          <w:tcPr>
-            <w:tcW w:type="dxa" w:w="2664"/>
-          </w:tcPr>
-          <w:p>
-            <w:r>
-              <w:rPr>
-                <w:b/>
-                <w:sz w:val="19"/>
-              </w:rPr>
-              <w:t>Clip</w:t>
-            </w:r>
-          </w:p>
-        </w:tc>
-        <w:tc>
-          <w:tcPr>
-            <w:tcW w:type="dxa" w:w="3096"/>
-          </w:tcPr>
-          <w:p>
-            <w:r>
-              <w:rPr>
-                <w:b/>
-                <w:sz w:val="19"/>
-              </w:rPr>
-              <w:t>Shows</w:t>
-            </w:r>
-          </w:p>
-        </w:tc>
-        <w:tc>
-          <w:tcPr>
-            <w:tcW w:type="dxa" w:w="2376"/>
-          </w:tcPr>
-          <w:p>
-            <w:r>
-              <w:rPr>
-                <w:b/>
-                <w:sz w:val="19"/>
-              </w:rPr>
-              <w:t>In–Out</w:t>
-            </w:r>
-          </w:p>
-        </w:tc>
-        <w:tc>
-          <w:tcPr>
-            <w:tcW w:type="dxa" w:w="1368"/>
-          </w:tcPr>
-          <w:p>
-            <w:r>
-              <w:rPr>
-                <w:b/>
-                <w:sz w:val="19"/>
-              </w:rPr>
-              <w:t>Status</w:t>
-            </w:r>
-          </w:p>
-        </w:tc>
-      </w:tr>
-      <w:tr>
-        <w:tc>
-          <w:tcPr>
-            <w:tcW w:type="dxa" w:w="432"/>
-          </w:tcPr>
-          <w:p>
-            <w:pPr>
-              <w:spacing w:after="40"/>
-            </w:pPr>
-            <w:r>
-              <w:rPr>
-                <w:sz w:val="19"/>
-              </w:rPr>
-              <w:t>1</w:t>
-            </w:r>
-          </w:p>
-        </w:tc>
-        <w:tc>
-          <w:tcPr>
-            <w:tcW w:type="dxa" w:w="2664"/>
-          </w:tcPr>
-          <w:p>
-            <w:pPr>
-              <w:spacing w:after="40"/>
-            </w:pPr>
-            <w:hyperlink r:id="rId15">
-              <w:r>
-                <w:rPr>
-                  <w:color w:val="1155CC"/>
-                  <w:u w:val="single"/>
-                </w:rPr>
-                <w:t xml:space="preserve">@typical_redhead_ — This McDonald's robot is wild</w:t>
-              </w:r>
-            </w:hyperlink>
-            <w:r>
-              <w:rPr>
-                <w:sz w:val="19"/>
-              </w:rPr>
-              <w:t xml:space="preserve"> · alt: </w:t>
-            </w:r>
-            <w:hyperlink r:id="rId16">
-              <w:r>
-                <w:rPr>
-                  <w:color w:val="1155CC"/>
-                  <w:u w:val="single"/>
-                </w:rPr>
-                <w:t xml:space="preserve">@kristinealise — Taco Bell "one thousand waters"</w:t>
-              </w:r>
-            </w:hyperlink>
-          </w:p>
-        </w:tc>
-        <w:tc>
-          <w:tcPr>
-            <w:tcW w:type="dxa" w:w="3096"/>
-          </w:tcPr>
-          <w:p>
-            <w:pPr>
-              <w:spacing w:after="40"/>
-            </w:pPr>
-            <w:r>
-              <w:rPr>
-                <w:sz w:val="19"/>
-              </w:rPr>
-              <w:t>McDonald's AI keeps adding McNuggets, 28 orders deep (Jan 2023, per TODAY). Alt: Taco Bell AI hands the car to a human (Jul 2025, per Daily Dot). Call later.</w:t>
-            </w:r>
-          </w:p>
-        </w:tc>
-        <w:tc>
-          <w:tcPr>
-            <w:tcW w:type="dxa" w:w="2376"/>
-          </w:tcPr>
-          <w:p>
-            <w:pPr>
-              <w:spacing w:after="40"/>
-            </w:pPr>
-            <w:r>
-              <w:rPr>
-                <w:sz w:val="19"/>
-              </w:rPr>
-              <w:t>—</w:t>
-            </w:r>
-          </w:p>
-        </w:tc>
-        <w:tc>
-          <w:tcPr>
-            <w:tcW w:type="dxa" w:w="1368"/>
-          </w:tcPr>
-          <w:p>
-            <w:pPr>
-              <w:spacing w:after="40"/>
-            </w:pPr>
-            <w:r>
-              <w:rPr>
-                <w:sz w:val="19"/>
-              </w:rPr>
-              <w:t>MANUAL · UNVERIFIED</w:t>
-            </w:r>
-          </w:p>
-        </w:tc>
-      </w:tr>
-      <w:tr>
-        <w:tc>
-          <w:tcPr>
-            <w:tcW w:type="dxa" w:w="432"/>
-          </w:tcPr>
-          <w:p>
-            <w:pPr>
-              <w:spacing w:after="40"/>
-            </w:pPr>
-            <w:r>
-              <w:rPr>
-                <w:sz w:val="19"/>
-              </w:rPr>
-              <w:t>2</w:t>
-            </w:r>
-          </w:p>
-        </w:tc>
-        <w:tc>
-          <w:tcPr>
-            <w:tcW w:type="dxa" w:w="2664"/>
-          </w:tcPr>
-          <w:p>
-            <w:pPr>
-              <w:spacing w:after="40"/>
-            </w:pPr>
-            <w:hyperlink r:id="rId17">
-              <w:r>
-                <w:rPr>
-                  <w:color w:val="1155CC"/>
-                  <w:u w:val="single"/>
-                </w:rPr>
-                <w:t xml:space="preserve">NBC News — Burger King's new AI chatbot to improve 'friendliness'</w:t>
-              </w:r>
-            </w:hyperlink>
-          </w:p>
-        </w:tc>
-        <w:tc>
-          <w:tcPr>
-            <w:tcW w:type="dxa" w:w="3096"/>
-          </w:tcPr>
-          <w:p>
-            <w:pPr>
-              <w:spacing w:after="40"/>
-            </w:pPr>
-            <w:r>
-              <w:rPr>
-                <w:sz w:val="19"/>
-              </w:rPr>
-              <w:t>Burger King's AI headset; "hospitality is fundamentally human," then AI drive-thru chatbots "aren't quite there yet" with a customer glitch.</w:t>
-            </w:r>
-          </w:p>
-        </w:tc>
-        <w:tc>
-          <w:tcPr>
-            <w:tcW w:type="dxa" w:w="2376"/>
-          </w:tcPr>
-          <w:p>
-            <w:pPr>
-              <w:spacing w:after="40"/>
-            </w:pPr>
-            <w:r>
-              <w:rPr>
-                <w:sz w:val="19"/>
-              </w:rPr>
-              <w:t>1:11–1:16 "hospitality is fundamentally human" BUTT 1:24–1:44 "AI, please remove that item"</w:t>
-            </w:r>
-          </w:p>
-        </w:tc>
-        <w:tc>
-          <w:tcPr>
-            <w:tcW w:type="dxa" w:w="1368"/>
-          </w:tcPr>
-          <w:p>
-            <w:pPr>
-              <w:spacing w:after="40"/>
-            </w:pPr>
-            <w:r>
-              <w:rPr>
-                <w:sz w:val="19"/>
-              </w:rPr>
-              <w:t>WEAK</w:t>
-            </w:r>
-          </w:p>
-        </w:tc>
-      </w:tr>
-      <w:tr>
-        <w:tc>
-          <w:tcPr>
-            <w:tcW w:type="dxa" w:w="432"/>
-          </w:tcPr>
-          <w:p>
-            <w:pPr>
-              <w:spacing w:after="40"/>
-            </w:pPr>
-            <w:r>
-              <w:rPr>
-                <w:sz w:val="19"/>
-              </w:rPr>
-              <w:t>3</w:t>
-            </w:r>
-          </w:p>
-        </w:tc>
-        <w:tc>
-          <w:tcPr>
-            <w:tcW w:type="dxa" w:w="2664"/>
-          </w:tcPr>
-          <w:p>
-            <w:pPr>
-              <w:spacing w:after="40"/>
-            </w:pPr>
-            <w:hyperlink r:id="rId18">
-              <w:r>
-                <w:rPr>
-                  <w:color w:val="1155CC"/>
-                  <w:u w:val="single"/>
-                </w:rPr>
-                <w:t xml:space="preserve">Ecomix Simple — McDonald's Is Retraining 2 Million Workers</w:t>
-              </w:r>
-            </w:hyperlink>
-          </w:p>
-        </w:tc>
-        <w:tc>
-          <w:tcPr>
-            <w:tcW w:type="dxa" w:w="3096"/>
-          </w:tcPr>
-          <w:p>
-            <w:pPr>
-              <w:spacing w:after="40"/>
-            </w:pPr>
-            <w:r>
-              <w:rPr>
-                <w:sz w:val="19"/>
-              </w:rPr>
-              <w:t>Narrated explainer: Oct 5, retraining 2 million-plus people "not on the app, on hospitality." Tiny channel, voice may be synthetic.</w:t>
-            </w:r>
-          </w:p>
-        </w:tc>
-        <w:tc>
-          <w:tcPr>
-            <w:tcW w:type="dxa" w:w="2376"/>
-          </w:tcPr>
-          <w:p>
-            <w:pPr>
-              <w:spacing w:after="40"/>
-            </w:pPr>
-            <w:r>
-              <w:rPr>
-                <w:sz w:val="19"/>
-              </w:rPr>
-              <w:t>0:16–0:29 "Not on the app. On hospitality."</w:t>
-            </w:r>
-          </w:p>
-        </w:tc>
-        <w:tc>
-          <w:tcPr>
-            <w:tcW w:type="dxa" w:w="1368"/>
-          </w:tcPr>
-          <w:p>
-            <w:pPr>
-              <w:spacing w:after="40"/>
-            </w:pPr>
-            <w:r>
-              <w:rPr>
-                <w:sz w:val="19"/>
-              </w:rPr>
-              <w:t>WEAK</w:t>
-            </w:r>
-          </w:p>
-        </w:tc>
-      </w:tr>
-    </w:tbl>
-    <w:p/>
-    <w:p>
-      <w:r>
-        <w:rPr>
-          <w:i/>
-        </w:rPr>
-        <w:t>Row 1: native TikToks; no captions and no Whisper this run. Rows 2–3: graphic fallback per producer if these don't hold up.</w:t>
-      </w:r>
-    </w:p>
     <w:p>
       <w:pPr>
         <w:pStyle w:val="Heading3"/>

</xml_diff>

<commit_message>
W 10-07 outline w/ videos: A reworked (Lipps, Isaacs, Elser + Fox News email beat), Stage: videos
Co-Authored-By: Claude Opus 5.5 <noreply@anthropic.com>
Claude-Session: https://claude.ai/code/session_01F5T5EfKU7bvTfCbU31zr39
</commit_message>
<xml_diff>
--- a/runs/W_10072026/10_07_OUTLINE_WED.docx
+++ b/runs/W_10072026/10_07_OUTLINE_WED.docx
@@ -57,7 +57,7 @@
         <w:t>Stage:</w:t>
       </w:r>
       <w:r>
-        <w:t xml:space="preserve"> beats · B and C clips carry over from 9/29</w:t>
+        <w:t xml:space="preserve"> videos</w:t>
       </w:r>
     </w:p>
     <w:p>
@@ -271,7 +271,7 @@
               <w:rPr>
                 <w:sz w:val="19"/>
               </w:rPr>
-              <w:t>7</w:t>
+              <w:t>8/8</w:t>
             </w:r>
           </w:p>
         </w:tc>
@@ -403,7 +403,7 @@
               <w:rPr>
                 <w:sz w:val="19"/>
               </w:rPr>
-              <w:t>3</w:t>
+              <w:t>3/3</w:t>
             </w:r>
           </w:p>
         </w:tc>
@@ -535,7 +535,7 @@
               <w:rPr>
                 <w:sz w:val="19"/>
               </w:rPr>
-              <w:t>3</w:t>
+              <w:t>3/3</w:t>
             </w:r>
           </w:p>
         </w:tc>
@@ -660,7 +660,7 @@
         <w:spacing w:after="40"/>
       </w:pPr>
       <w:r>
-        <w:t>A beats 5–8 (Isaacs, Elser) are new and not yet searched. Beats 2–4 reuse the 9/29 Lipps clips (A beat 2 WEAK). The Fargo chief's apology is now only an alt for A beat 3.</w:t>
+        <w:t>A runs 10 beats, one over the limit, because Elser takes three (doorbell, car, the chief's email). Fox News was added by the producer; cut A beat 9 if A runs long. A beat 2 is still WEAK (no Lipps soundbite).</w:t>
       </w:r>
     </w:p>
     <w:p>
@@ -669,7 +669,7 @@
         <w:spacing w:after="40"/>
       </w:pPr>
       <w:r>
-        <w:t>🚨 Flock was ruled overdone, and a scan shows Elser's case was a Flock hit too, so two of three women are Flock cases. Keep the brand, or say "a license-plate camera"?</w:t>
+        <w:t>🚨 Two of three women are Flock cases, and Flock was ruled overdone. Name the brand, or say "a license-plate camera"?</w:t>
       </w:r>
     </w:p>
     <w:p>
@@ -678,7 +678,7 @@
         <w:spacing w:after="40"/>
       </w:pPr>
       <w:r>
-        <w:t>A says keep your location history; B says turn location off for store apps. Both can air, but Jeff says plainly that the history can also be subpoenaed.</w:t>
+        <w:t>A says keep your location history; B says turn location off for store apps. Jeff says plainly the history can also be subpoenaed.</w:t>
       </w:r>
     </w:p>
     <w:p>
@@ -687,7 +687,7 @@
         <w:spacing w:after="40"/>
       </w:pPr>
       <w:r>
-        <w:t>B beat 2 (Target basket): the rework note says cut it; the producer ruled 9/29 to keep it. Not cut. Your call.</w:t>
+        <w:t>B beat 2 (Target basket) is kept per the 9/29 ruling. B beat 1 is a CROP. B beat 3 has no named person.</w:t>
       </w:r>
     </w:p>
     <w:p>
@@ -696,7 +696,7 @@
         <w:spacing w:after="40"/>
       </w:pPr>
       <w:r>
-        <w:t>Google's default auto-delete is unverified. Jeff says "check yours." Lipps is 50, under 55+.</w:t>
+        <w:t>C beat 1: two TikToks; call later. C beat 2 and C beat 3 are WEAK; graphic fallback.</w:t>
       </w:r>
     </w:p>
     <w:p>
@@ -735,7 +735,7 @@
         <w:t>Peg:</w:t>
       </w:r>
       <w:r>
-        <w:t xml:space="preserve"> Angela Lipps filed a $10 million suit Sept 15; Lindsey Isaacs testified at a U.S. Senate hearing Sept 23.</w:t>
+        <w:t xml:space="preserve"> Angela Lipps filed a $10 million suit Sept 15; Lindsey Isaacs testified to a Senate judiciary panel Sept 23.</w:t>
       </w:r>
     </w:p>
     <w:p>
@@ -746,7 +746,7 @@
         <w:t>Weight:</w:t>
       </w:r>
       <w:r>
-        <w:t xml:space="preserve"> ~50% of show · 7 clip beats</w:t>
+        <w:t xml:space="preserve"> ~50% of show · 8 clip beats</w:t>
       </w:r>
     </w:p>
     <w:tbl>
@@ -995,22 +995,7 @@
               <w:rPr>
                 <w:sz w:val="19"/>
               </w:rPr>
-              <w:t xml:space="preserve">HAVE · HORIZONTAL — </w:t>
-            </w:r>
-            <w:hyperlink r:id="rId9">
-              <w:r>
-                <w:rPr>
-                  <w:color w:val="1155CC"/>
-                  <w:u w:val="single"/>
-                </w:rPr>
-                <w:t xml:space="preserve">ABC News 4 / WCYB</w:t>
-              </w:r>
-            </w:hyperlink>
-            <w:r>
-              <w:rPr>
-                <w:sz w:val="19"/>
-              </w:rPr>
-              <w:t xml:space="preserve"> (9/29 WEAK); want Lipps herself on WDAY</w:t>
+              <w:t>HAVE · HORIZONTAL</w:t>
             </w:r>
           </w:p>
         </w:tc>
@@ -1092,22 +1077,7 @@
               <w:rPr>
                 <w:sz w:val="19"/>
               </w:rPr>
-              <w:t xml:space="preserve">HAVE · HORIZONTAL — </w:t>
-            </w:r>
-            <w:hyperlink r:id="rId9">
-              <w:r>
-                <w:rPr>
-                  <w:color w:val="1155CC"/>
-                  <w:u w:val="single"/>
-                </w:rPr>
-                <w:t xml:space="preserve">ABC News 4 / WCYB</w:t>
-              </w:r>
-            </w:hyperlink>
-            <w:r>
-              <w:rPr>
-                <w:sz w:val="19"/>
-              </w:rPr>
-              <w:t>, attorney on the match; alt: Fargo chief's March apology</w:t>
+              <w:t>HAVE · HORIZONTAL</w:t>
             </w:r>
           </w:p>
         </w:tc>
@@ -1189,22 +1159,7 @@
               <w:rPr>
                 <w:sz w:val="19"/>
               </w:rPr>
-              <w:t xml:space="preserve">HAVE · HORIZONTAL — </w:t>
-            </w:r>
-            <w:hyperlink r:id="rId10">
-              <w:r>
-                <w:rPr>
-                  <w:color w:val="1155CC"/>
-                  <w:u w:val="single"/>
-                </w:rPr>
-                <w:t xml:space="preserve">CBS News</w:t>
-              </w:r>
-            </w:hyperlink>
-            <w:r>
-              <w:rPr>
-                <w:sz w:val="19"/>
-              </w:rPr>
-              <w:t>, jail and release</w:t>
+              <w:t>HAVE · HORIZONTAL</w:t>
             </w:r>
           </w:p>
         </w:tc>
@@ -1254,7 +1209,7 @@
               <w:rPr>
                 <w:sz w:val="19"/>
               </w:rPr>
-              <w:t>Lindsey Isaacs, wrongly accused driver</w:t>
+              <w:t>Lindsey Isaacs, 23, Palm Coast, Florida</w:t>
             </w:r>
           </w:p>
         </w:tc>
@@ -1270,7 +1225,7 @@
               <w:rPr>
                 <w:sz w:val="19"/>
               </w:rPr>
-              <w:t>Witnesses saw a maroon Durango at a triple-fatal crash; a plate reader caught her black one, and she's charged.</w:t>
+              <w:t>Witnesses saw a maroon Durango; a Flock camera caught her black one 3 miles away, and she's charged in three deaths.</w:t>
             </w:r>
           </w:p>
         </w:tc>
@@ -1286,7 +1241,7 @@
               <w:rPr>
                 <w:sz w:val="19"/>
               </w:rPr>
-              <w:t>FIND · HORIZONTAL — Isaacs interview (CNN, 404 Media, Fox 35)</w:t>
+              <w:t>FIND · HORIZONTAL</w:t>
             </w:r>
           </w:p>
         </w:tc>
@@ -1352,7 +1307,7 @@
               <w:rPr>
                 <w:sz w:val="19"/>
               </w:rPr>
-              <w:t>She tells U.S. senators her cell door wasn't opened for about 86 hours; her car had no damage.</w:t>
+              <w:t>She tells senators her cell door stayed shut about 86 hours; she spent 13 days in jail before bond.</w:t>
             </w:r>
           </w:p>
         </w:tc>
@@ -1368,7 +1323,7 @@
               <w:rPr>
                 <w:sz w:val="19"/>
               </w:rPr>
-              <w:t>FIND · HORIZONTAL — Isaacs' Senate testimony (Fox 35 Orlando, USA Today)</w:t>
+              <w:t>FIND · HORIZONTAL</w:t>
             </w:r>
           </w:p>
         </w:tc>
@@ -1418,7 +1373,7 @@
               <w:rPr>
                 <w:sz w:val="19"/>
               </w:rPr>
-              <w:t>Chrisanna Elser, Colorado driver</w:t>
+              <w:t>Chrisanna Elser, almost 50, Denver area</w:t>
             </w:r>
           </w:p>
         </w:tc>
@@ -1450,7 +1405,7 @@
               <w:rPr>
                 <w:sz w:val="19"/>
               </w:rPr>
-              <w:t>FIND · VERTICAL — Elser's doorbell exchange, via CBS Colorado or FOX31</w:t>
+              <w:t>FIND · VERTICAL</w:t>
             </w:r>
           </w:p>
         </w:tc>
@@ -1516,7 +1471,7 @@
               <w:rPr>
                 <w:sz w:val="19"/>
               </w:rPr>
-              <w:t>Her Rivian's cameras logged her route; weeks later the chief emails "nicely done btw" and drops the summons.</w:t>
+              <w:t>Her truck's cameras logged every minute of her route, and she spends weeks proving where she was.</w:t>
             </w:r>
           </w:p>
         </w:tc>
@@ -1532,7 +1487,7 @@
               <w:rPr>
                 <w:sz w:val="19"/>
               </w:rPr>
-              <w:t>FIND · HORIZONTAL — CBS Colorado interview with Elser</w:t>
+              <w:t>FIND · HORIZONTAL</w:t>
             </w:r>
           </w:p>
         </w:tc>
@@ -1551,6 +1506,88 @@
                 <w:sz w:val="19"/>
               </w:rPr>
               <w:t>9</w:t>
+            </w:r>
+          </w:p>
+        </w:tc>
+        <w:tc>
+          <w:tcPr>
+            <w:tcW w:type="dxa" w:w="1656"/>
+          </w:tcPr>
+          <w:p>
+            <w:pPr>
+              <w:spacing w:after="40"/>
+            </w:pPr>
+            <w:r>
+              <w:rPr>
+                <w:sz w:val="19"/>
+              </w:rPr>
+              <w:t>"Nicely done, btw"</w:t>
+            </w:r>
+          </w:p>
+        </w:tc>
+        <w:tc>
+          <w:tcPr>
+            <w:tcW w:type="dxa" w:w="2160"/>
+          </w:tcPr>
+          <w:p>
+            <w:pPr>
+              <w:spacing w:after="40"/>
+            </w:pPr>
+            <w:r>
+              <w:rPr>
+                <w:sz w:val="19"/>
+              </w:rPr>
+              <w:t>Columbine Valley police chief</w:t>
+            </w:r>
+          </w:p>
+        </w:tc>
+        <w:tc>
+          <w:tcPr>
+            <w:tcW w:type="dxa" w:w="4104"/>
+          </w:tcPr>
+          <w:p>
+            <w:pPr>
+              <w:spacing w:after="40"/>
+            </w:pPr>
+            <w:r>
+              <w:rPr>
+                <w:sz w:val="19"/>
+              </w:rPr>
+              <w:t>His email voids her summons with "nicely done, by the way"; she says nobody ever apologized.</w:t>
+            </w:r>
+          </w:p>
+        </w:tc>
+        <w:tc>
+          <w:tcPr>
+            <w:tcW w:type="dxa" w:w="1584"/>
+          </w:tcPr>
+          <w:p>
+            <w:pPr>
+              <w:spacing w:after="40"/>
+            </w:pPr>
+            <w:r>
+              <w:rPr>
+                <w:sz w:val="19"/>
+              </w:rPr>
+              <w:t>FIND · HORIZONTAL</w:t>
+            </w:r>
+          </w:p>
+        </w:tc>
+      </w:tr>
+      <w:tr>
+        <w:tc>
+          <w:tcPr>
+            <w:tcW w:type="dxa" w:w="432"/>
+          </w:tcPr>
+          <w:p>
+            <w:pPr>
+              <w:spacing w:after="40"/>
+            </w:pPr>
+            <w:r>
+              <w:rPr>
+                <w:sz w:val="19"/>
+              </w:rPr>
+              <w:t>10</w:t>
             </w:r>
           </w:p>
         </w:tc>
@@ -1630,6 +1667,795 @@
           <w:color w:val="333333"/>
           <w:sz w:val="22"/>
         </w:rPr>
+        <w:t>Videos</w:t>
+      </w:r>
+    </w:p>
+    <w:tbl>
+      <w:tblPr>
+        <w:tblStyle w:val="TableGrid"/>
+        <w:tblW w:type="auto" w:w="0"/>
+        <w:jc w:val="center"/>
+        <w:tblLayout w:type="fixed"/>
+        <w:tblLook w:firstColumn="1" w:firstRow="1" w:lastColumn="0" w:lastRow="0" w:noHBand="0" w:noVBand="1" w:val="04A0"/>
+      </w:tblPr>
+      <w:tblGrid>
+        <w:gridCol w:w="432"/>
+        <w:gridCol w:w="2664"/>
+        <w:gridCol w:w="3096"/>
+        <w:gridCol w:w="2376"/>
+        <w:gridCol w:w="1368"/>
+      </w:tblGrid>
+      <w:tr>
+        <w:tc>
+          <w:tcPr>
+            <w:tcW w:type="dxa" w:w="432"/>
+          </w:tcPr>
+          <w:p>
+            <w:r>
+              <w:rPr>
+                <w:b/>
+                <w:sz w:val="19"/>
+              </w:rPr>
+              <w:t>#</w:t>
+            </w:r>
+          </w:p>
+        </w:tc>
+        <w:tc>
+          <w:tcPr>
+            <w:tcW w:type="dxa" w:w="2664"/>
+          </w:tcPr>
+          <w:p>
+            <w:r>
+              <w:rPr>
+                <w:b/>
+                <w:sz w:val="19"/>
+              </w:rPr>
+              <w:t>Clip</w:t>
+            </w:r>
+          </w:p>
+        </w:tc>
+        <w:tc>
+          <w:tcPr>
+            <w:tcW w:type="dxa" w:w="3096"/>
+          </w:tcPr>
+          <w:p>
+            <w:r>
+              <w:rPr>
+                <w:b/>
+                <w:sz w:val="19"/>
+              </w:rPr>
+              <w:t>Shows</w:t>
+            </w:r>
+          </w:p>
+        </w:tc>
+        <w:tc>
+          <w:tcPr>
+            <w:tcW w:type="dxa" w:w="2376"/>
+          </w:tcPr>
+          <w:p>
+            <w:r>
+              <w:rPr>
+                <w:b/>
+                <w:sz w:val="19"/>
+              </w:rPr>
+              <w:t>In–Out</w:t>
+            </w:r>
+          </w:p>
+        </w:tc>
+        <w:tc>
+          <w:tcPr>
+            <w:tcW w:type="dxa" w:w="1368"/>
+          </w:tcPr>
+          <w:p>
+            <w:r>
+              <w:rPr>
+                <w:b/>
+                <w:sz w:val="19"/>
+              </w:rPr>
+              <w:t>Status</w:t>
+            </w:r>
+          </w:p>
+        </w:tc>
+      </w:tr>
+      <w:tr>
+        <w:tc>
+          <w:tcPr>
+            <w:tcW w:type="dxa" w:w="432"/>
+          </w:tcPr>
+          <w:p>
+            <w:pPr>
+              <w:spacing w:after="40"/>
+            </w:pPr>
+            <w:r>
+              <w:rPr>
+                <w:sz w:val="19"/>
+              </w:rPr>
+              <w:t>2</w:t>
+            </w:r>
+          </w:p>
+        </w:tc>
+        <w:tc>
+          <w:tcPr>
+            <w:tcW w:type="dxa" w:w="2664"/>
+          </w:tcPr>
+          <w:p>
+            <w:pPr>
+              <w:spacing w:after="40"/>
+            </w:pPr>
+            <w:hyperlink r:id="rId9">
+              <w:r>
+                <w:rPr>
+                  <w:color w:val="1155CC"/>
+                  <w:u w:val="single"/>
+                </w:rPr>
+                <w:t xml:space="preserve">ABC News 4 / WCYB — Tennessee grandma mistakenly sent to North Dakota jail due to AI error</w:t>
+              </w:r>
+            </w:hyperlink>
+          </w:p>
+        </w:tc>
+        <w:tc>
+          <w:tcPr>
+            <w:tcW w:type="dxa" w:w="3096"/>
+          </w:tcPr>
+          <w:p>
+            <w:pPr>
+              <w:spacing w:after="40"/>
+            </w:pPr>
+            <w:r>
+              <w:rPr>
+                <w:sz w:val="19"/>
+              </w:rPr>
+              <w:t>Local package: US Marshals at her Carter County house, 50-year-old grandmother of five, a state she'd never visited. Reporter voiceover.</w:t>
+            </w:r>
+          </w:p>
+        </w:tc>
+        <w:tc>
+          <w:tcPr>
+            <w:tcW w:type="dxa" w:w="2376"/>
+          </w:tcPr>
+          <w:p>
+            <w:pPr>
+              <w:spacing w:after="40"/>
+            </w:pPr>
+            <w:r>
+              <w:rPr>
+                <w:sz w:val="19"/>
+              </w:rPr>
+              <w:t>0:16–0:31 "a state she'd never even visited"</w:t>
+            </w:r>
+          </w:p>
+        </w:tc>
+        <w:tc>
+          <w:tcPr>
+            <w:tcW w:type="dxa" w:w="1368"/>
+          </w:tcPr>
+          <w:p>
+            <w:pPr>
+              <w:spacing w:after="40"/>
+            </w:pPr>
+            <w:r>
+              <w:rPr>
+                <w:sz w:val="19"/>
+              </w:rPr>
+              <w:t>WEAK</w:t>
+            </w:r>
+          </w:p>
+        </w:tc>
+      </w:tr>
+      <w:tr>
+        <w:tc>
+          <w:tcPr>
+            <w:tcW w:type="dxa" w:w="432"/>
+          </w:tcPr>
+          <w:p>
+            <w:pPr>
+              <w:spacing w:after="40"/>
+            </w:pPr>
+            <w:r>
+              <w:rPr>
+                <w:sz w:val="19"/>
+              </w:rPr>
+              <w:t>3</w:t>
+            </w:r>
+          </w:p>
+        </w:tc>
+        <w:tc>
+          <w:tcPr>
+            <w:tcW w:type="dxa" w:w="2664"/>
+          </w:tcPr>
+          <w:p>
+            <w:pPr>
+              <w:spacing w:after="40"/>
+            </w:pPr>
+            <w:hyperlink r:id="rId9">
+              <w:r>
+                <w:rPr>
+                  <w:color w:val="1155CC"/>
+                  <w:u w:val="single"/>
+                </w:rPr>
+                <w:t xml:space="preserve">ABC News 4 / WCYB — same package</w:t>
+              </w:r>
+            </w:hyperlink>
+          </w:p>
+        </w:tc>
+        <w:tc>
+          <w:tcPr>
+            <w:tcW w:type="dxa" w:w="3096"/>
+          </w:tcPr>
+          <w:p>
+            <w:pPr>
+              <w:spacing w:after="40"/>
+            </w:pPr>
+            <w:r>
+              <w:rPr>
+                <w:sz w:val="19"/>
+              </w:rPr>
+              <w:t>Attorney Eric Rice: an AI program selected her face and an officer reviewed her social media; then the fake military ID bank fraud.</w:t>
+            </w:r>
+          </w:p>
+        </w:tc>
+        <w:tc>
+          <w:tcPr>
+            <w:tcW w:type="dxa" w:w="2376"/>
+          </w:tcPr>
+          <w:p>
+            <w:pPr>
+              <w:spacing w:after="40"/>
+            </w:pPr>
+            <w:r>
+              <w:rPr>
+                <w:sz w:val="19"/>
+              </w:rPr>
+              <w:t>0:31–0:46 "an arrest warrant to be issued for her" BUTT 0:46–1:00 "between April and May of 2025"</w:t>
+            </w:r>
+          </w:p>
+        </w:tc>
+        <w:tc>
+          <w:tcPr>
+            <w:tcW w:type="dxa" w:w="1368"/>
+          </w:tcPr>
+          <w:p>
+            <w:pPr>
+              <w:spacing w:after="40"/>
+            </w:pPr>
+            <w:r>
+              <w:rPr>
+                <w:sz w:val="19"/>
+              </w:rPr>
+              <w:t>PICK</w:t>
+            </w:r>
+          </w:p>
+        </w:tc>
+      </w:tr>
+      <w:tr>
+        <w:tc>
+          <w:tcPr>
+            <w:tcW w:type="dxa" w:w="432"/>
+          </w:tcPr>
+          <w:p>
+            <w:pPr>
+              <w:spacing w:after="40"/>
+            </w:pPr>
+            <w:r>
+              <w:rPr>
+                <w:sz w:val="19"/>
+              </w:rPr>
+              <w:t>4</w:t>
+            </w:r>
+          </w:p>
+        </w:tc>
+        <w:tc>
+          <w:tcPr>
+            <w:tcW w:type="dxa" w:w="2664"/>
+          </w:tcPr>
+          <w:p>
+            <w:pPr>
+              <w:spacing w:after="40"/>
+            </w:pPr>
+            <w:hyperlink r:id="rId10">
+              <w:r>
+                <w:rPr>
+                  <w:color w:val="1155CC"/>
+                  <w:u w:val="single"/>
+                </w:rPr>
+                <w:t xml:space="preserve">CBS News — Grandmother falsely accused of bank fraud sues Fargo</w:t>
+              </w:r>
+            </w:hyperlink>
+          </w:p>
+        </w:tc>
+        <w:tc>
+          <w:tcPr>
+            <w:tcW w:type="dxa" w:w="3096"/>
+          </w:tcPr>
+          <w:p>
+            <w:pPr>
+              <w:spacing w:after="40"/>
+            </w:pPr>
+            <w:r>
+              <w:rPr>
+                <w:sz w:val="19"/>
+              </w:rPr>
+              <w:t>Correspondent: months behind bars, couldn't make bail, bank records freed her, released Christmas Eve in the clothes she was booked in.</w:t>
+            </w:r>
+          </w:p>
+        </w:tc>
+        <w:tc>
+          <w:tcPr>
+            <w:tcW w:type="dxa" w:w="2376"/>
+          </w:tcPr>
+          <w:p>
+            <w:pPr>
+              <w:spacing w:after="40"/>
+            </w:pPr>
+            <w:r>
+              <w:rPr>
+                <w:sz w:val="19"/>
+              </w:rPr>
+              <w:t>1:16–1:46 "the same clothes she was booked in in July"</w:t>
+            </w:r>
+          </w:p>
+        </w:tc>
+        <w:tc>
+          <w:tcPr>
+            <w:tcW w:type="dxa" w:w="1368"/>
+          </w:tcPr>
+          <w:p>
+            <w:pPr>
+              <w:spacing w:after="40"/>
+            </w:pPr>
+            <w:r>
+              <w:rPr>
+                <w:sz w:val="19"/>
+              </w:rPr>
+              <w:t>PICK</w:t>
+            </w:r>
+          </w:p>
+        </w:tc>
+      </w:tr>
+      <w:tr>
+        <w:tc>
+          <w:tcPr>
+            <w:tcW w:type="dxa" w:w="432"/>
+          </w:tcPr>
+          <w:p>
+            <w:pPr>
+              <w:spacing w:after="40"/>
+            </w:pPr>
+            <w:r>
+              <w:rPr>
+                <w:sz w:val="19"/>
+              </w:rPr>
+              <w:t>5</w:t>
+            </w:r>
+          </w:p>
+        </w:tc>
+        <w:tc>
+          <w:tcPr>
+            <w:tcW w:type="dxa" w:w="2664"/>
+          </w:tcPr>
+          <w:p>
+            <w:pPr>
+              <w:spacing w:after="40"/>
+            </w:pPr>
+            <w:hyperlink r:id="rId11">
+              <w:r>
+                <w:rPr>
+                  <w:color w:val="1155CC"/>
+                  <w:u w:val="single"/>
+                </w:rPr>
+                <w:t xml:space="preserve">Atlanta News First / InvestigateTV — Wrong car, false arrest</w:t>
+              </w:r>
+            </w:hyperlink>
+          </w:p>
+        </w:tc>
+        <w:tc>
+          <w:tcPr>
+            <w:tcW w:type="dxa" w:w="3096"/>
+          </w:tcPr>
+          <w:p>
+            <w:pPr>
+              <w:spacing w:after="40"/>
+            </w:pPr>
+            <w:r>
+              <w:rPr>
+                <w:sz w:val="19"/>
+              </w:rPr>
+              <w:t>Isaacs on camera; her black Durango on a Flock camera 3 miles west, eight felonies; then witnesses' maroon Durango and a partial plate that didn't match.</w:t>
+            </w:r>
+          </w:p>
+        </w:tc>
+        <w:tc>
+          <w:tcPr>
+            <w:tcW w:type="dxa" w:w="2376"/>
+          </w:tcPr>
+          <w:p>
+            <w:pPr>
+              <w:spacing w:after="40"/>
+            </w:pPr>
+            <w:r>
+              <w:rPr>
+                <w:sz w:val="19"/>
+              </w:rPr>
+              <w:t>0:30–0:54 "leaving the scene of a fatal crash" BUTT 3:36–3:56 "the Flock images of her black Durango"</w:t>
+            </w:r>
+          </w:p>
+        </w:tc>
+        <w:tc>
+          <w:tcPr>
+            <w:tcW w:type="dxa" w:w="1368"/>
+          </w:tcPr>
+          <w:p>
+            <w:pPr>
+              <w:spacing w:after="40"/>
+            </w:pPr>
+            <w:r>
+              <w:rPr>
+                <w:sz w:val="19"/>
+              </w:rPr>
+              <w:t>PICK</w:t>
+            </w:r>
+          </w:p>
+        </w:tc>
+      </w:tr>
+      <w:tr>
+        <w:tc>
+          <w:tcPr>
+            <w:tcW w:type="dxa" w:w="432"/>
+          </w:tcPr>
+          <w:p>
+            <w:pPr>
+              <w:spacing w:after="40"/>
+            </w:pPr>
+            <w:r>
+              <w:rPr>
+                <w:sz w:val="19"/>
+              </w:rPr>
+              <w:t>6</w:t>
+            </w:r>
+          </w:p>
+        </w:tc>
+        <w:tc>
+          <w:tcPr>
+            <w:tcW w:type="dxa" w:w="2664"/>
+          </w:tcPr>
+          <w:p>
+            <w:pPr>
+              <w:spacing w:after="40"/>
+            </w:pPr>
+            <w:hyperlink r:id="rId12">
+              <w:r>
+                <w:rPr>
+                  <w:color w:val="1155CC"/>
+                  <w:u w:val="single"/>
+                </w:rPr>
+                <w:t xml:space="preserve">USA TODAY — Woman tells Senate Flock camera influenced wrongful arrest</w:t>
+              </w:r>
+            </w:hyperlink>
+          </w:p>
+        </w:tc>
+        <w:tc>
+          <w:tcPr>
+            <w:tcW w:type="dxa" w:w="3096"/>
+          </w:tcPr>
+          <w:p>
+            <w:pPr>
+              <w:spacing w:after="40"/>
+            </w:pPr>
+            <w:r>
+              <w:rPr>
+                <w:sz w:val="19"/>
+              </w:rPr>
+              <w:t>Isaacs' own Senate testimony: solitary, a suicide-prevention dress, the door not opened for about 86 hours; then release after 13 days.</w:t>
+            </w:r>
+          </w:p>
+        </w:tc>
+        <w:tc>
+          <w:tcPr>
+            <w:tcW w:type="dxa" w:w="2376"/>
+          </w:tcPr>
+          <w:p>
+            <w:pPr>
+              <w:spacing w:after="40"/>
+            </w:pPr>
+            <w:r>
+              <w:rPr>
+                <w:sz w:val="19"/>
+              </w:rPr>
+              <w:t>3:16–3:47 "opened for approximately 86 hours" BUTT 5:34–5:42 "I ran into my mother and father's arms"</w:t>
+            </w:r>
+          </w:p>
+        </w:tc>
+        <w:tc>
+          <w:tcPr>
+            <w:tcW w:type="dxa" w:w="1368"/>
+          </w:tcPr>
+          <w:p>
+            <w:pPr>
+              <w:spacing w:after="40"/>
+            </w:pPr>
+            <w:r>
+              <w:rPr>
+                <w:sz w:val="19"/>
+              </w:rPr>
+              <w:t>PICK</w:t>
+            </w:r>
+          </w:p>
+        </w:tc>
+      </w:tr>
+      <w:tr>
+        <w:tc>
+          <w:tcPr>
+            <w:tcW w:type="dxa" w:w="432"/>
+          </w:tcPr>
+          <w:p>
+            <w:pPr>
+              <w:spacing w:after="40"/>
+            </w:pPr>
+            <w:r>
+              <w:rPr>
+                <w:sz w:val="19"/>
+              </w:rPr>
+              <w:t>7</w:t>
+            </w:r>
+          </w:p>
+        </w:tc>
+        <w:tc>
+          <w:tcPr>
+            <w:tcW w:type="dxa" w:w="2664"/>
+          </w:tcPr>
+          <w:p>
+            <w:pPr>
+              <w:spacing w:after="40"/>
+            </w:pPr>
+            <w:hyperlink r:id="rId13">
+              <w:r>
+                <w:rPr>
+                  <w:color w:val="1155CC"/>
+                  <w:u w:val="single"/>
+                </w:rPr>
+                <w:t xml:space="preserve">9NEWS — Woman wrongly accused of theft by officer who used Flock cameras (Short)</w:t>
+              </w:r>
+            </w:hyperlink>
+          </w:p>
+        </w:tc>
+        <w:tc>
+          <w:tcPr>
+            <w:tcW w:type="dxa" w:w="3096"/>
+          </w:tcPr>
+          <w:p>
+            <w:pPr>
+              <w:spacing w:after="40"/>
+            </w:pPr>
+            <w:r>
+              <w:rPr>
+                <w:sz w:val="19"/>
+              </w:rPr>
+              <w:t>Vertical. Doorbell audio: "You don't know why I'm here," "I've got that on my phone right now of you taking that package"; then "If you go to court, you can."</w:t>
+            </w:r>
+          </w:p>
+        </w:tc>
+        <w:tc>
+          <w:tcPr>
+            <w:tcW w:type="dxa" w:w="2376"/>
+          </w:tcPr>
+          <w:p>
+            <w:pPr>
+              <w:spacing w:after="40"/>
+            </w:pPr>
+            <w:r>
+              <w:rPr>
+                <w:sz w:val="19"/>
+              </w:rPr>
+              <w:t>0:21–0:47 "you taking that package" BUTT 1:29–1:45 "extend you any courtesy"</w:t>
+            </w:r>
+          </w:p>
+        </w:tc>
+        <w:tc>
+          <w:tcPr>
+            <w:tcW w:type="dxa" w:w="1368"/>
+          </w:tcPr>
+          <w:p>
+            <w:pPr>
+              <w:spacing w:after="40"/>
+            </w:pPr>
+            <w:r>
+              <w:rPr>
+                <w:sz w:val="19"/>
+              </w:rPr>
+              <w:t>PICK</w:t>
+            </w:r>
+          </w:p>
+        </w:tc>
+      </w:tr>
+      <w:tr>
+        <w:tc>
+          <w:tcPr>
+            <w:tcW w:type="dxa" w:w="432"/>
+          </w:tcPr>
+          <w:p>
+            <w:pPr>
+              <w:spacing w:after="40"/>
+            </w:pPr>
+            <w:r>
+              <w:rPr>
+                <w:sz w:val="19"/>
+              </w:rPr>
+              <w:t>8</w:t>
+            </w:r>
+          </w:p>
+        </w:tc>
+        <w:tc>
+          <w:tcPr>
+            <w:tcW w:type="dxa" w:w="2664"/>
+          </w:tcPr>
+          <w:p>
+            <w:pPr>
+              <w:spacing w:after="40"/>
+            </w:pPr>
+            <w:hyperlink r:id="rId14">
+              <w:r>
+                <w:rPr>
+                  <w:color w:val="1155CC"/>
+                  <w:u w:val="single"/>
+                </w:rPr>
+                <w:t xml:space="preserve">CBS Colorado — Colorado woman says she had to use technology to prove she wasn't a porch pirate</w:t>
+              </w:r>
+            </w:hyperlink>
+          </w:p>
+        </w:tc>
+        <w:tc>
+          <w:tcPr>
+            <w:tcW w:type="dxa" w:w="3096"/>
+          </w:tcPr>
+          <w:p>
+            <w:pPr>
+              <w:spacing w:after="40"/>
+            </w:pPr>
+            <w:r>
+              <w:rPr>
+                <w:sz w:val="19"/>
+              </w:rPr>
+              <w:t>Her truck's built-in cameras "recording every moment she was on the road"; "at 9:22 I drove through Bowmar"; weeks later the chief's email.</w:t>
+            </w:r>
+          </w:p>
+        </w:tc>
+        <w:tc>
+          <w:tcPr>
+            <w:tcW w:type="dxa" w:w="2376"/>
+          </w:tcPr>
+          <w:p>
+            <w:pPr>
+              <w:spacing w:after="40"/>
+            </w:pPr>
+            <w:r>
+              <w:rPr>
+                <w:sz w:val="19"/>
+              </w:rPr>
+              <w:t>1:56–2:22 "clearing that summons"</w:t>
+            </w:r>
+          </w:p>
+        </w:tc>
+        <w:tc>
+          <w:tcPr>
+            <w:tcW w:type="dxa" w:w="1368"/>
+          </w:tcPr>
+          <w:p>
+            <w:pPr>
+              <w:spacing w:after="40"/>
+            </w:pPr>
+            <w:r>
+              <w:rPr>
+                <w:sz w:val="19"/>
+              </w:rPr>
+              <w:t>PICK</w:t>
+            </w:r>
+          </w:p>
+        </w:tc>
+      </w:tr>
+      <w:tr>
+        <w:tc>
+          <w:tcPr>
+            <w:tcW w:type="dxa" w:w="432"/>
+          </w:tcPr>
+          <w:p>
+            <w:pPr>
+              <w:spacing w:after="40"/>
+            </w:pPr>
+            <w:r>
+              <w:rPr>
+                <w:sz w:val="19"/>
+              </w:rPr>
+              <w:t>9</w:t>
+            </w:r>
+          </w:p>
+        </w:tc>
+        <w:tc>
+          <w:tcPr>
+            <w:tcW w:type="dxa" w:w="2664"/>
+          </w:tcPr>
+          <w:p>
+            <w:pPr>
+              <w:spacing w:after="40"/>
+            </w:pPr>
+            <w:hyperlink r:id="rId15">
+              <w:r>
+                <w:rPr>
+                  <w:color w:val="1155CC"/>
+                  <w:u w:val="single"/>
+                </w:rPr>
+                <w:t xml:space="preserve">Fox News — FALSELY ACCUSED: Woman fights Flock camera catch with OWN evidence</w:t>
+              </w:r>
+            </w:hyperlink>
+          </w:p>
+        </w:tc>
+        <w:tc>
+          <w:tcPr>
+            <w:tcW w:type="dxa" w:w="3096"/>
+          </w:tcPr>
+          <w:p>
+            <w:pPr>
+              <w:spacing w:after="40"/>
+            </w:pPr>
+            <w:r>
+              <w:rPr>
+                <w:sz w:val="19"/>
+              </w:rPr>
+              <w:t>Anchor reads the chief's email: "nicely done, by the way, we have voided the summons"; Elser: no apology from police or Flock.</w:t>
+            </w:r>
+          </w:p>
+        </w:tc>
+        <w:tc>
+          <w:tcPr>
+            <w:tcW w:type="dxa" w:w="2376"/>
+          </w:tcPr>
+          <w:p>
+            <w:pPr>
+              <w:spacing w:after="40"/>
+            </w:pPr>
+            <w:r>
+              <w:rPr>
+                <w:sz w:val="19"/>
+              </w:rPr>
+              <w:t>1:58–2:16 "No, I did not."</w:t>
+            </w:r>
+          </w:p>
+        </w:tc>
+        <w:tc>
+          <w:tcPr>
+            <w:tcW w:type="dxa" w:w="1368"/>
+          </w:tcPr>
+          <w:p>
+            <w:pPr>
+              <w:spacing w:after="40"/>
+            </w:pPr>
+            <w:r>
+              <w:rPr>
+                <w:sz w:val="19"/>
+              </w:rPr>
+              <w:t>PICK</w:t>
+            </w:r>
+          </w:p>
+        </w:tc>
+      </w:tr>
+    </w:tbl>
+    <w:p/>
+    <w:p>
+      <w:r>
+        <w:rPr>
+          <w:i/>
+        </w:rPr>
+        <w:t>Rows 2–4 carried from the 9/29 run. Rows 5–9 verified against captions 9/29. Row 8 ends on the chief's email and row 9 reads it; trim row 8 to 2:11 "I went to my tailor" if both air. Alternates: FOX 35 Orlando M-Vfh-Z9I24 (same hearing feed as row 6).</w:t>
+      </w:r>
+    </w:p>
+    <w:p>
+      <w:pPr>
+        <w:pStyle w:val="Heading3"/>
+      </w:pPr>
+      <w:r>
+        <w:rPr>
+          <w:color w:val="333333"/>
+          <w:sz w:val="22"/>
+        </w:rPr>
         <w:t>The fix</w:t>
       </w:r>
     </w:p>
@@ -1645,7 +2471,7 @@
         <w:t>Your alibi is on a timer.</w:t>
       </w:r>
       <w:r>
-        <w:t xml:space="preserve"> Records cleared all three: Lipps with bank statements, Elser with her car's cameras. And police came months later: about two months for Lipps, about six for Isaacs.</w:t>
+        <w:t xml:space="preserve"> Records cleared all three: Lipps with bank statements, Isaacs with photos of her undamaged car, Elser with her truck's cameras. And the arrests came months later: about two months after the thefts for Lipps, a warrant six months after the crash for Isaacs.</w:t>
       </w:r>
     </w:p>
     <w:p>
@@ -1702,7 +2528,7 @@
         <w:t>Know your other records:</w:t>
       </w:r>
       <w:r>
-        <w:t xml:space="preserve"> how long your doorbell and dashcam keep footage, and that bank statements show where you were.</w:t>
+        <w:t xml:space="preserve"> how long your doorbell and dashcam keep footage, and that bank statements and receipts show where you were.</w:t>
       </w:r>
     </w:p>
     <w:p>
@@ -1750,7 +2576,7 @@
         <w:spacing w:after="40"/>
       </w:pPr>
       <w:r>
-        <w:t>⚠️ Beats 3–4: Clearview AI, 108 days and "no one interviewed her" are new figures; the 9/29 outline had "months" and an unnamed AI tool. Pull the complaint. Suit date: Sept 15 here, Sept 16 per MPR.</w:t>
+        <w:t>⚠️ Beats 3–4: Clearview AI, 108 days and "no one interviewed her" are new figures; pull the complaint. Suit date: Sept 15 here, Sept 16 per MPR.</w:t>
       </w:r>
     </w:p>
     <w:p>
@@ -1759,7 +2585,7 @@
         <w:spacing w:after="40"/>
       </w:pPr>
       <w:r>
-        <w:t>⚠️ Beats 5–6: which Senate committee held the hearing. Outlets say 13 days in jail; the brief says about 10 in maximum security. Isaacs' state (I-4, Fox 35 Orlando: likely Florida).</w:t>
+        <w:t>⚠️ Beat 6: CNN calls it "a Senate judiciary panel"; confirm the subcommittee. Isaacs is 23, well under 55+.</w:t>
       </w:r>
     </w:p>
     <w:p>
@@ -1768,7 +2594,7 @@
         <w:spacing w:after="40"/>
       </w:pPr>
       <w:r>
-        <w:t>⚠️ Beats 7–8: Elser's accusation came from a Flock hit (per 9NEWS, FOX31 titles). "Nicely done btw" and the discipline (9NEWS) need the source loaded.</w:t>
+        <w:t>⚠️ Beat 10: troopers were at Isaacs' door the day of the crash (Oct 5, 2025); the warrant came April 17, 2026. So a three-month auto-delete would have erased her phone's record of that night before the warrant, not before the first knock. Her phone data didn't free her; say "could have helped."</w:t>
       </w:r>
     </w:p>
     <w:p>
@@ -1777,7 +2603,16 @@
         <w:spacing w:after="40"/>
       </w:pPr>
       <w:r>
-        <w:t>⚠️ Beat 9: Google's default auto-delete isn't on its help page. One tester who turned Timeline on Sept 14, 2026 found it set to 3 months. At that setting, Isaacs' proof would have been gone before troopers knocked; say "could have been."</w:t>
+        <w:t>⚠️ Beat 10: Google's default auto-delete isn't on its help page. The 3-month figure is one tester's phone. Jeff says "check yours."</w:t>
+      </w:r>
+    </w:p>
+    <w:p>
+      <w:pPr>
+        <w:pStyle w:val="ListBullet"/>
+        <w:spacing w:after="40"/>
+      </w:pPr>
+      <w:r>
+        <w:t>Single source: Atlanta News First says Florida's governor began pulling Flock and other plate readers off state roads. Verify before air.</w:t>
       </w:r>
     </w:p>
     <w:p>
@@ -1994,22 +2829,7 @@
               <w:rPr>
                 <w:sz w:val="19"/>
               </w:rPr>
-              <w:t xml:space="preserve">HAVE · VERTICAL BROLL — </w:t>
-            </w:r>
-            <w:hyperlink r:id="rId11">
-              <w:r>
-                <w:rPr>
-                  <w:color w:val="1155CC"/>
-                  <w:u w:val="single"/>
-                </w:rPr>
-                <w:t xml:space="preserve">Instacart, Meet Caper Cart</w:t>
-              </w:r>
-            </w:hyperlink>
-            <w:r>
-              <w:rPr>
-                <w:sz w:val="19"/>
-              </w:rPr>
-              <w:t xml:space="preserve"> (CROP)</w:t>
+              <w:t>FIND · VERTICAL BROLL — Caper Cart in an aisle</w:t>
             </w:r>
           </w:p>
         </w:tc>
@@ -2091,17 +2911,8 @@
               <w:rPr>
                 <w:sz w:val="19"/>
               </w:rPr>
-              <w:t xml:space="preserve">HAVE · VERTICAL — </w:t>
+              <w:t>HAVE · VERTICAL — TikTok @user60342208753</w:t>
             </w:r>
-            <w:hyperlink r:id="rId12">
-              <w:r>
-                <w:rPr>
-                  <w:color w:val="1155CC"/>
-                  <w:u w:val="single"/>
-                </w:rPr>
-                <w:t xml:space="preserve">TikTok @user60342208753</w:t>
-              </w:r>
-            </w:hyperlink>
           </w:p>
         </w:tc>
       </w:tr>
@@ -2182,17 +2993,8 @@
               <w:rPr>
                 <w:sz w:val="19"/>
               </w:rPr>
-              <w:t xml:space="preserve">HAVE · HORIZONTAL — </w:t>
+              <w:t>FIND · HORIZONTAL — plate cameras at a home store</w:t>
             </w:r>
-            <w:hyperlink r:id="rId13">
-              <w:r>
-                <w:rPr>
-                  <w:color w:val="1155CC"/>
-                  <w:u w:val="single"/>
-                </w:rPr>
-                <w:t xml:space="preserve">NBC Connecticut, plate readers at Lowe's</w:t>
-              </w:r>
-            </w:hyperlink>
           </w:p>
         </w:tc>
       </w:tr>
@@ -2289,6 +3091,370 @@
           <w:color w:val="333333"/>
           <w:sz w:val="22"/>
         </w:rPr>
+        <w:t>Videos</w:t>
+      </w:r>
+    </w:p>
+    <w:tbl>
+      <w:tblPr>
+        <w:tblStyle w:val="TableGrid"/>
+        <w:tblW w:type="auto" w:w="0"/>
+        <w:jc w:val="center"/>
+        <w:tblLayout w:type="fixed"/>
+        <w:tblLook w:firstColumn="1" w:firstRow="1" w:lastColumn="0" w:lastRow="0" w:noHBand="0" w:noVBand="1" w:val="04A0"/>
+      </w:tblPr>
+      <w:tblGrid>
+        <w:gridCol w:w="432"/>
+        <w:gridCol w:w="2664"/>
+        <w:gridCol w:w="3096"/>
+        <w:gridCol w:w="2376"/>
+        <w:gridCol w:w="1368"/>
+      </w:tblGrid>
+      <w:tr>
+        <w:tc>
+          <w:tcPr>
+            <w:tcW w:type="dxa" w:w="432"/>
+          </w:tcPr>
+          <w:p>
+            <w:r>
+              <w:rPr>
+                <w:b/>
+                <w:sz w:val="19"/>
+              </w:rPr>
+              <w:t>#</w:t>
+            </w:r>
+          </w:p>
+        </w:tc>
+        <w:tc>
+          <w:tcPr>
+            <w:tcW w:type="dxa" w:w="2664"/>
+          </w:tcPr>
+          <w:p>
+            <w:r>
+              <w:rPr>
+                <w:b/>
+                <w:sz w:val="19"/>
+              </w:rPr>
+              <w:t>Clip</w:t>
+            </w:r>
+          </w:p>
+        </w:tc>
+        <w:tc>
+          <w:tcPr>
+            <w:tcW w:type="dxa" w:w="3096"/>
+          </w:tcPr>
+          <w:p>
+            <w:r>
+              <w:rPr>
+                <w:b/>
+                <w:sz w:val="19"/>
+              </w:rPr>
+              <w:t>Shows</w:t>
+            </w:r>
+          </w:p>
+        </w:tc>
+        <w:tc>
+          <w:tcPr>
+            <w:tcW w:type="dxa" w:w="2376"/>
+          </w:tcPr>
+          <w:p>
+            <w:r>
+              <w:rPr>
+                <w:b/>
+                <w:sz w:val="19"/>
+              </w:rPr>
+              <w:t>In–Out</w:t>
+            </w:r>
+          </w:p>
+        </w:tc>
+        <w:tc>
+          <w:tcPr>
+            <w:tcW w:type="dxa" w:w="1368"/>
+          </w:tcPr>
+          <w:p>
+            <w:r>
+              <w:rPr>
+                <w:b/>
+                <w:sz w:val="19"/>
+              </w:rPr>
+              <w:t>Status</w:t>
+            </w:r>
+          </w:p>
+        </w:tc>
+      </w:tr>
+      <w:tr>
+        <w:tc>
+          <w:tcPr>
+            <w:tcW w:type="dxa" w:w="432"/>
+          </w:tcPr>
+          <w:p>
+            <w:pPr>
+              <w:spacing w:after="40"/>
+            </w:pPr>
+            <w:r>
+              <w:rPr>
+                <w:sz w:val="19"/>
+              </w:rPr>
+              <w:t>1</w:t>
+            </w:r>
+          </w:p>
+        </w:tc>
+        <w:tc>
+          <w:tcPr>
+            <w:tcW w:type="dxa" w:w="2664"/>
+          </w:tcPr>
+          <w:p>
+            <w:pPr>
+              <w:spacing w:after="40"/>
+            </w:pPr>
+            <w:hyperlink r:id="rId16">
+              <w:r>
+                <w:rPr>
+                  <w:color w:val="1155CC"/>
+                  <w:u w:val="single"/>
+                </w:rPr>
+                <w:t xml:space="preserve">Instacart — Meet Caper Cart</w:t>
+              </w:r>
+            </w:hyperlink>
+          </w:p>
+        </w:tc>
+        <w:tc>
+          <w:tcPr>
+            <w:tcW w:type="dxa" w:w="3096"/>
+          </w:tcPr>
+          <w:p>
+            <w:pPr>
+              <w:spacing w:after="40"/>
+            </w:pPr>
+            <w:r>
+              <w:rPr>
+                <w:sz w:val="19"/>
+              </w:rPr>
+              <w:t>The cart in an aisle, items dropped in, computer-vision cameras, then location-based deals and personalized ads.</w:t>
+            </w:r>
+          </w:p>
+        </w:tc>
+        <w:tc>
+          <w:tcPr>
+            <w:tcW w:type="dxa" w:w="2376"/>
+          </w:tcPr>
+          <w:p>
+            <w:pPr>
+              <w:spacing w:after="40"/>
+            </w:pPr>
+            <w:r>
+              <w:rPr>
+                <w:sz w:val="19"/>
+              </w:rPr>
+              <w:t>0:00–0:43 "them and even add them back" BUTT 0:48–1:08 "your customer's"</w:t>
+            </w:r>
+          </w:p>
+        </w:tc>
+        <w:tc>
+          <w:tcPr>
+            <w:tcW w:type="dxa" w:w="1368"/>
+          </w:tcPr>
+          <w:p>
+            <w:pPr>
+              <w:spacing w:after="40"/>
+            </w:pPr>
+            <w:r>
+              <w:rPr>
+                <w:sz w:val="19"/>
+              </w:rPr>
+              <w:t>PICK · CROP</w:t>
+            </w:r>
+          </w:p>
+        </w:tc>
+      </w:tr>
+      <w:tr>
+        <w:tc>
+          <w:tcPr>
+            <w:tcW w:type="dxa" w:w="432"/>
+          </w:tcPr>
+          <w:p>
+            <w:pPr>
+              <w:spacing w:after="40"/>
+            </w:pPr>
+            <w:r>
+              <w:rPr>
+                <w:sz w:val="19"/>
+              </w:rPr>
+              <w:t>2</w:t>
+            </w:r>
+          </w:p>
+        </w:tc>
+        <w:tc>
+          <w:tcPr>
+            <w:tcW w:type="dxa" w:w="2664"/>
+          </w:tcPr>
+          <w:p>
+            <w:pPr>
+              <w:spacing w:after="40"/>
+            </w:pPr>
+            <w:hyperlink r:id="rId17">
+              <w:r>
+                <w:rPr>
+                  <w:color w:val="1155CC"/>
+                  <w:u w:val="single"/>
+                </w:rPr>
+                <w:t xml:space="preserve">@user60342208753 — Target basket tracker</w:t>
+              </w:r>
+            </w:hyperlink>
+          </w:p>
+        </w:tc>
+        <w:tc>
+          <w:tcPr>
+            <w:tcW w:type="dxa" w:w="3096"/>
+          </w:tcPr>
+          <w:p>
+            <w:pPr>
+              <w:spacing w:after="40"/>
+            </w:pPr>
+            <w:r>
+              <w:rPr>
+                <w:sz w:val="19"/>
+              </w:rPr>
+              <w:t>Store worker calls the box on a basket a tracker, per caption and press write-up. Posted Aug 29.</w:t>
+            </w:r>
+          </w:p>
+        </w:tc>
+        <w:tc>
+          <w:tcPr>
+            <w:tcW w:type="dxa" w:w="2376"/>
+          </w:tcPr>
+          <w:p>
+            <w:pPr>
+              <w:spacing w:after="40"/>
+            </w:pPr>
+            <w:r>
+              <w:rPr>
+                <w:sz w:val="19"/>
+              </w:rPr>
+              <w:t>—</w:t>
+            </w:r>
+          </w:p>
+        </w:tc>
+        <w:tc>
+          <w:tcPr>
+            <w:tcW w:type="dxa" w:w="1368"/>
+          </w:tcPr>
+          <w:p>
+            <w:pPr>
+              <w:spacing w:after="40"/>
+            </w:pPr>
+            <w:r>
+              <w:rPr>
+                <w:sz w:val="19"/>
+              </w:rPr>
+              <w:t>MANUAL · UNVERIFIED</w:t>
+            </w:r>
+          </w:p>
+        </w:tc>
+      </w:tr>
+      <w:tr>
+        <w:tc>
+          <w:tcPr>
+            <w:tcW w:type="dxa" w:w="432"/>
+          </w:tcPr>
+          <w:p>
+            <w:pPr>
+              <w:spacing w:after="40"/>
+            </w:pPr>
+            <w:r>
+              <w:rPr>
+                <w:sz w:val="19"/>
+              </w:rPr>
+              <w:t>3</w:t>
+            </w:r>
+          </w:p>
+        </w:tc>
+        <w:tc>
+          <w:tcPr>
+            <w:tcW w:type="dxa" w:w="2664"/>
+          </w:tcPr>
+          <w:p>
+            <w:pPr>
+              <w:spacing w:after="40"/>
+            </w:pPr>
+            <w:hyperlink r:id="rId18">
+              <w:r>
+                <w:rPr>
+                  <w:color w:val="1155CC"/>
+                  <w:u w:val="single"/>
+                </w:rPr>
+                <w:t xml:space="preserve">NBC Connecticut — License plate readers now at Home Depot, Lowe's</w:t>
+              </w:r>
+            </w:hyperlink>
+          </w:p>
+        </w:tc>
+        <w:tc>
+          <w:tcPr>
+            <w:tcW w:type="dxa" w:w="3096"/>
+          </w:tcPr>
+          <w:p>
+            <w:pPr>
+              <w:spacing w:after="40"/>
+            </w:pPr>
+            <w:r>
+              <w:rPr>
+                <w:sz w:val="19"/>
+              </w:rPr>
+              <w:t>Plate cameras at a Lowe's entrance in Newington, CT, then a professor on oversight and data retention.</w:t>
+            </w:r>
+          </w:p>
+        </w:tc>
+        <w:tc>
+          <w:tcPr>
+            <w:tcW w:type="dxa" w:w="2376"/>
+          </w:tcPr>
+          <w:p>
+            <w:pPr>
+              <w:spacing w:after="40"/>
+            </w:pPr>
+            <w:r>
+              <w:rPr>
+                <w:sz w:val="19"/>
+              </w:rPr>
+              <w:t>0:17–0:51 "now using them to prevent theft. It's an" BUTT 1:22–1:37 "accountability, data retention."</w:t>
+            </w:r>
+          </w:p>
+        </w:tc>
+        <w:tc>
+          <w:tcPr>
+            <w:tcW w:type="dxa" w:w="1368"/>
+          </w:tcPr>
+          <w:p>
+            <w:pPr>
+              <w:spacing w:after="40"/>
+            </w:pPr>
+            <w:r>
+              <w:rPr>
+                <w:sz w:val="19"/>
+              </w:rPr>
+              <w:t>PICK</w:t>
+            </w:r>
+          </w:p>
+        </w:tc>
+      </w:tr>
+    </w:tbl>
+    <w:p/>
+    <w:p>
+      <w:r>
+        <w:rPr>
+          <w:i/>
+        </w:rPr>
+        <w:t>Rows 1 and 3 reused from run LIVE_10072026 and re-verified against captions this run. Row 2: no caption track, and media downloads blocked, so no Whisper.</w:t>
+      </w:r>
+    </w:p>
+    <w:p>
+      <w:pPr>
+        <w:pStyle w:val="Heading3"/>
+      </w:pPr>
+      <w:r>
+        <w:rPr>
+          <w:color w:val="333333"/>
+          <w:sz w:val="22"/>
+        </w:rPr>
         <w:t>The fix</w:t>
       </w:r>
     </w:p>
@@ -2370,7 +3536,7 @@
         <w:spacing w:after="40"/>
       </w:pPr>
       <w:r>
-        <w:t>Jeff's Jan 22 show covered store tracking. New here: the AI carts and the beacon.</w:t>
+        <w:t>Jeff's Jan 22 "These Stores Are Spying On You" covered store tracking. New here: the AI carts and the basket beacon.</w:t>
       </w:r>
     </w:p>
     <w:p>
@@ -2587,37 +3753,7 @@
               <w:rPr>
                 <w:sz w:val="19"/>
               </w:rPr>
-              <w:t xml:space="preserve">HAVE · VERTICAL — </w:t>
-            </w:r>
-            <w:hyperlink r:id="rId14">
-              <w:r>
-                <w:rPr>
-                  <w:color w:val="1155CC"/>
-                  <w:u w:val="single"/>
-                </w:rPr>
-                <w:t xml:space="preserve">@typical_redhead_</w:t>
-              </w:r>
-            </w:hyperlink>
-            <w:r>
-              <w:rPr>
-                <w:sz w:val="19"/>
-              </w:rPr>
-              <w:t xml:space="preserve"> or </w:t>
-            </w:r>
-            <w:hyperlink r:id="rId15">
-              <w:r>
-                <w:rPr>
-                  <w:color w:val="1155CC"/>
-                  <w:u w:val="single"/>
-                </w:rPr>
-                <w:t xml:space="preserve">@kristinealise</w:t>
-              </w:r>
-            </w:hyperlink>
-            <w:r>
-              <w:rPr>
-                <w:sz w:val="19"/>
-              </w:rPr>
-              <w:t>, call later</w:t>
+              <w:t>FIND · VERTICAL — viral AI drive-thru fail</w:t>
             </w:r>
           </w:p>
         </w:tc>
@@ -2699,22 +3835,7 @@
               <w:rPr>
                 <w:sz w:val="19"/>
               </w:rPr>
-              <w:t xml:space="preserve">HAVE · HORIZONTAL — </w:t>
-            </w:r>
-            <w:hyperlink r:id="rId16">
-              <w:r>
-                <w:rPr>
-                  <w:color w:val="1155CC"/>
-                  <w:u w:val="single"/>
-                </w:rPr>
-                <w:t xml:space="preserve">NBC News, Burger King AI</w:t>
-              </w:r>
-            </w:hyperlink>
-            <w:r>
-              <w:rPr>
-                <w:sz w:val="19"/>
-              </w:rPr>
-              <w:t>, found 9/29 (WEAK)</w:t>
+              <w:t>FIND · HORIZONTAL — news on the Burger King drive-offs</w:t>
             </w:r>
           </w:p>
         </w:tc>
@@ -2796,22 +3917,7 @@
               <w:rPr>
                 <w:sz w:val="19"/>
               </w:rPr>
-              <w:t xml:space="preserve">HAVE · HORIZONTAL — </w:t>
-            </w:r>
-            <w:hyperlink r:id="rId17">
-              <w:r>
-                <w:rPr>
-                  <w:color w:val="1155CC"/>
-                  <w:u w:val="single"/>
-                </w:rPr>
-                <w:t xml:space="preserve">Ecomix Simple, McDonald's retraining</w:t>
-              </w:r>
-            </w:hyperlink>
-            <w:r>
-              <w:rPr>
-                <w:sz w:val="19"/>
-              </w:rPr>
-              <w:t>, found 9/29 (WEAK)</w:t>
+              <w:t>FIND · HORIZONTAL — McDonald's retraining news</w:t>
             </w:r>
           </w:p>
         </w:tc>
@@ -2900,6 +4006,385 @@
       </w:tr>
     </w:tbl>
     <w:p/>
+    <w:p>
+      <w:pPr>
+        <w:pStyle w:val="Heading3"/>
+      </w:pPr>
+      <w:r>
+        <w:rPr>
+          <w:color w:val="333333"/>
+          <w:sz w:val="22"/>
+        </w:rPr>
+        <w:t>Videos</w:t>
+      </w:r>
+    </w:p>
+    <w:tbl>
+      <w:tblPr>
+        <w:tblStyle w:val="TableGrid"/>
+        <w:tblW w:type="auto" w:w="0"/>
+        <w:jc w:val="center"/>
+        <w:tblLayout w:type="fixed"/>
+        <w:tblLook w:firstColumn="1" w:firstRow="1" w:lastColumn="0" w:lastRow="0" w:noHBand="0" w:noVBand="1" w:val="04A0"/>
+      </w:tblPr>
+      <w:tblGrid>
+        <w:gridCol w:w="432"/>
+        <w:gridCol w:w="2664"/>
+        <w:gridCol w:w="3096"/>
+        <w:gridCol w:w="2376"/>
+        <w:gridCol w:w="1368"/>
+      </w:tblGrid>
+      <w:tr>
+        <w:tc>
+          <w:tcPr>
+            <w:tcW w:type="dxa" w:w="432"/>
+          </w:tcPr>
+          <w:p>
+            <w:r>
+              <w:rPr>
+                <w:b/>
+                <w:sz w:val="19"/>
+              </w:rPr>
+              <w:t>#</w:t>
+            </w:r>
+          </w:p>
+        </w:tc>
+        <w:tc>
+          <w:tcPr>
+            <w:tcW w:type="dxa" w:w="2664"/>
+          </w:tcPr>
+          <w:p>
+            <w:r>
+              <w:rPr>
+                <w:b/>
+                <w:sz w:val="19"/>
+              </w:rPr>
+              <w:t>Clip</w:t>
+            </w:r>
+          </w:p>
+        </w:tc>
+        <w:tc>
+          <w:tcPr>
+            <w:tcW w:type="dxa" w:w="3096"/>
+          </w:tcPr>
+          <w:p>
+            <w:r>
+              <w:rPr>
+                <w:b/>
+                <w:sz w:val="19"/>
+              </w:rPr>
+              <w:t>Shows</w:t>
+            </w:r>
+          </w:p>
+        </w:tc>
+        <w:tc>
+          <w:tcPr>
+            <w:tcW w:type="dxa" w:w="2376"/>
+          </w:tcPr>
+          <w:p>
+            <w:r>
+              <w:rPr>
+                <w:b/>
+                <w:sz w:val="19"/>
+              </w:rPr>
+              <w:t>In–Out</w:t>
+            </w:r>
+          </w:p>
+        </w:tc>
+        <w:tc>
+          <w:tcPr>
+            <w:tcW w:type="dxa" w:w="1368"/>
+          </w:tcPr>
+          <w:p>
+            <w:r>
+              <w:rPr>
+                <w:b/>
+                <w:sz w:val="19"/>
+              </w:rPr>
+              <w:t>Status</w:t>
+            </w:r>
+          </w:p>
+        </w:tc>
+      </w:tr>
+      <w:tr>
+        <w:tc>
+          <w:tcPr>
+            <w:tcW w:type="dxa" w:w="432"/>
+          </w:tcPr>
+          <w:p>
+            <w:pPr>
+              <w:spacing w:after="40"/>
+            </w:pPr>
+            <w:r>
+              <w:rPr>
+                <w:sz w:val="19"/>
+              </w:rPr>
+              <w:t>1</w:t>
+            </w:r>
+          </w:p>
+        </w:tc>
+        <w:tc>
+          <w:tcPr>
+            <w:tcW w:type="dxa" w:w="2664"/>
+          </w:tcPr>
+          <w:p>
+            <w:pPr>
+              <w:spacing w:after="40"/>
+            </w:pPr>
+            <w:hyperlink r:id="rId19">
+              <w:r>
+                <w:rPr>
+                  <w:color w:val="1155CC"/>
+                  <w:u w:val="single"/>
+                </w:rPr>
+                <w:t xml:space="preserve">@typical_redhead_ — This McDonald's robot is wild</w:t>
+              </w:r>
+            </w:hyperlink>
+            <w:r>
+              <w:rPr>
+                <w:sz w:val="19"/>
+              </w:rPr>
+              <w:t xml:space="preserve"> · alt: </w:t>
+            </w:r>
+            <w:hyperlink r:id="rId20">
+              <w:r>
+                <w:rPr>
+                  <w:color w:val="1155CC"/>
+                  <w:u w:val="single"/>
+                </w:rPr>
+                <w:t xml:space="preserve">@kristinealise — Taco Bell "one thousand waters"</w:t>
+              </w:r>
+            </w:hyperlink>
+          </w:p>
+        </w:tc>
+        <w:tc>
+          <w:tcPr>
+            <w:tcW w:type="dxa" w:w="3096"/>
+          </w:tcPr>
+          <w:p>
+            <w:pPr>
+              <w:spacing w:after="40"/>
+            </w:pPr>
+            <w:r>
+              <w:rPr>
+                <w:sz w:val="19"/>
+              </w:rPr>
+              <w:t>McDonald's AI keeps adding McNuggets, 28 orders deep (Jan 2023, per TODAY). Alt: Taco Bell AI hands the car to a human (Jul 2025, per Daily Dot). Call later.</w:t>
+            </w:r>
+          </w:p>
+        </w:tc>
+        <w:tc>
+          <w:tcPr>
+            <w:tcW w:type="dxa" w:w="2376"/>
+          </w:tcPr>
+          <w:p>
+            <w:pPr>
+              <w:spacing w:after="40"/>
+            </w:pPr>
+            <w:r>
+              <w:rPr>
+                <w:sz w:val="19"/>
+              </w:rPr>
+              <w:t>—</w:t>
+            </w:r>
+          </w:p>
+        </w:tc>
+        <w:tc>
+          <w:tcPr>
+            <w:tcW w:type="dxa" w:w="1368"/>
+          </w:tcPr>
+          <w:p>
+            <w:pPr>
+              <w:spacing w:after="40"/>
+            </w:pPr>
+            <w:r>
+              <w:rPr>
+                <w:sz w:val="19"/>
+              </w:rPr>
+              <w:t>MANUAL · UNVERIFIED</w:t>
+            </w:r>
+          </w:p>
+        </w:tc>
+      </w:tr>
+      <w:tr>
+        <w:tc>
+          <w:tcPr>
+            <w:tcW w:type="dxa" w:w="432"/>
+          </w:tcPr>
+          <w:p>
+            <w:pPr>
+              <w:spacing w:after="40"/>
+            </w:pPr>
+            <w:r>
+              <w:rPr>
+                <w:sz w:val="19"/>
+              </w:rPr>
+              <w:t>2</w:t>
+            </w:r>
+          </w:p>
+        </w:tc>
+        <w:tc>
+          <w:tcPr>
+            <w:tcW w:type="dxa" w:w="2664"/>
+          </w:tcPr>
+          <w:p>
+            <w:pPr>
+              <w:spacing w:after="40"/>
+            </w:pPr>
+            <w:hyperlink r:id="rId21">
+              <w:r>
+                <w:rPr>
+                  <w:color w:val="1155CC"/>
+                  <w:u w:val="single"/>
+                </w:rPr>
+                <w:t xml:space="preserve">NBC News — Burger King's new AI chatbot to improve 'friendliness'</w:t>
+              </w:r>
+            </w:hyperlink>
+          </w:p>
+        </w:tc>
+        <w:tc>
+          <w:tcPr>
+            <w:tcW w:type="dxa" w:w="3096"/>
+          </w:tcPr>
+          <w:p>
+            <w:pPr>
+              <w:spacing w:after="40"/>
+            </w:pPr>
+            <w:r>
+              <w:rPr>
+                <w:sz w:val="19"/>
+              </w:rPr>
+              <w:t>Burger King's AI headset; "hospitality is fundamentally human," then AI drive-thru chatbots "aren't quite there yet" with a customer glitch.</w:t>
+            </w:r>
+          </w:p>
+        </w:tc>
+        <w:tc>
+          <w:tcPr>
+            <w:tcW w:type="dxa" w:w="2376"/>
+          </w:tcPr>
+          <w:p>
+            <w:pPr>
+              <w:spacing w:after="40"/>
+            </w:pPr>
+            <w:r>
+              <w:rPr>
+                <w:sz w:val="19"/>
+              </w:rPr>
+              <w:t>1:11–1:16 "hospitality is fundamentally human" BUTT 1:24–1:44 "AI, please remove that item"</w:t>
+            </w:r>
+          </w:p>
+        </w:tc>
+        <w:tc>
+          <w:tcPr>
+            <w:tcW w:type="dxa" w:w="1368"/>
+          </w:tcPr>
+          <w:p>
+            <w:pPr>
+              <w:spacing w:after="40"/>
+            </w:pPr>
+            <w:r>
+              <w:rPr>
+                <w:sz w:val="19"/>
+              </w:rPr>
+              <w:t>WEAK</w:t>
+            </w:r>
+          </w:p>
+        </w:tc>
+      </w:tr>
+      <w:tr>
+        <w:tc>
+          <w:tcPr>
+            <w:tcW w:type="dxa" w:w="432"/>
+          </w:tcPr>
+          <w:p>
+            <w:pPr>
+              <w:spacing w:after="40"/>
+            </w:pPr>
+            <w:r>
+              <w:rPr>
+                <w:sz w:val="19"/>
+              </w:rPr>
+              <w:t>3</w:t>
+            </w:r>
+          </w:p>
+        </w:tc>
+        <w:tc>
+          <w:tcPr>
+            <w:tcW w:type="dxa" w:w="2664"/>
+          </w:tcPr>
+          <w:p>
+            <w:pPr>
+              <w:spacing w:after="40"/>
+            </w:pPr>
+            <w:hyperlink r:id="rId22">
+              <w:r>
+                <w:rPr>
+                  <w:color w:val="1155CC"/>
+                  <w:u w:val="single"/>
+                </w:rPr>
+                <w:t xml:space="preserve">Ecomix Simple — McDonald's Is Retraining 2 Million Workers</w:t>
+              </w:r>
+            </w:hyperlink>
+          </w:p>
+        </w:tc>
+        <w:tc>
+          <w:tcPr>
+            <w:tcW w:type="dxa" w:w="3096"/>
+          </w:tcPr>
+          <w:p>
+            <w:pPr>
+              <w:spacing w:after="40"/>
+            </w:pPr>
+            <w:r>
+              <w:rPr>
+                <w:sz w:val="19"/>
+              </w:rPr>
+              <w:t>Narrated explainer: Oct 5, retraining 2 million-plus people "not on the app, on hospitality." Tiny channel, voice may be synthetic.</w:t>
+            </w:r>
+          </w:p>
+        </w:tc>
+        <w:tc>
+          <w:tcPr>
+            <w:tcW w:type="dxa" w:w="2376"/>
+          </w:tcPr>
+          <w:p>
+            <w:pPr>
+              <w:spacing w:after="40"/>
+            </w:pPr>
+            <w:r>
+              <w:rPr>
+                <w:sz w:val="19"/>
+              </w:rPr>
+              <w:t>0:16–0:29 "Not on the app. On hospitality."</w:t>
+            </w:r>
+          </w:p>
+        </w:tc>
+        <w:tc>
+          <w:tcPr>
+            <w:tcW w:type="dxa" w:w="1368"/>
+          </w:tcPr>
+          <w:p>
+            <w:pPr>
+              <w:spacing w:after="40"/>
+            </w:pPr>
+            <w:r>
+              <w:rPr>
+                <w:sz w:val="19"/>
+              </w:rPr>
+              <w:t>WEAK</w:t>
+            </w:r>
+          </w:p>
+        </w:tc>
+      </w:tr>
+    </w:tbl>
+    <w:p/>
+    <w:p>
+      <w:r>
+        <w:rPr>
+          <w:i/>
+        </w:rPr>
+        <w:t>Row 1: native TikToks; no captions and no Whisper this run. Rows 2–3: graphic fallback per producer if these don't hold up.</w:t>
+      </w:r>
+    </w:p>
     <w:p>
       <w:pPr>
         <w:pStyle w:val="Heading3"/>

</xml_diff>